<commit_message>
docs: refuerza dirección ejecutiva en CV maestro
</commit_message>
<xml_diff>
--- a/boveda-entrevista-profesional/busqueda-empleo/presentacion-espontanea/cv-maestro.docx
+++ b/boveda-entrevista-profesional/busqueda-empleo/presentacion-espontanea/cv-maestro.docx
@@ -85,7 +85,7 @@
           <w:color w:val="20242A"/>
           <w:sz w:val="19"/>
         </w:rPr>
-        <w:t>He dirigido de forma transversal personas, operaciones, sistemas, logística y parte de la administración; analizo procesos, modelo información y convierto tareas manuales en flujos documentados y automatizados. He aplicado ese enfoque a la selección y acogida de personal, el control logístico, la gestión documental y los procesos administrativos y recaudatorios.</w:t>
+        <w:t>He dirigido de forma transversal personas, operaciones, sistemas, logística y parte de la administración. He coordinado directamente a responsables de tienda y preparado informes para el Consejo de Dirección. Analizo procesos, modelo información y convierto tareas manuales en flujos documentados y automatizados; he aplicado ese enfoque al control logístico, la gestión documental, los procesos administrativos y recaudatorios y la gestión de personas.</w:t>
       </w:r>
     </w:p>
     <w:p>
@@ -125,7 +125,7 @@
           <w:color w:val="20242A"/>
           <w:sz w:val="18"/>
         </w:rPr>
-        <w:t>He coordinado directamente a responsables de tienda, mantenido entrevistas semanales y un canal de puerta abierta con el personal; también he diseñado procesos de selección, incorporación y seguimiento e informes para el Consejo de Dirección.</w:t>
+        <w:t>He asumido responsabilidades simultáneas en RR. HH., IT, operaciones, logística y parte de administración; he coordinado directamente a responsables de tienda, mantenido entrevistas semanales y un canal de puerta abierta con el personal, y preparado informes para el Consejo de Dirección.</w:t>
       </w:r>
     </w:p>
     <w:p>
@@ -261,7 +261,7 @@
           <w:color w:val="20242A"/>
           <w:sz w:val="18"/>
         </w:rPr>
-        <w:t>He diseñado con programación propia, Trello y Notion la gestión de candidaturas, precontratación, incorporación y seguimiento; he modelado datos y separado los personales de los profesionales.</w:t>
+        <w:t>He coordinado directamente a responsables de tienda, mantenido entrevistas semanales y un canal de puerta abierta con el personal.</w:t>
       </w:r>
     </w:p>
     <w:p>
@@ -280,7 +280,7 @@
           <w:color w:val="20242A"/>
           <w:sz w:val="18"/>
         </w:rPr>
-        <w:t>He redactado vacantes, cribado CV, realizado entrevistas, preparado informes para el Consejo de Dirección y estructurado seguimientos a 15, 30 y 90 días.</w:t>
+        <w:t>He diseñado una base de datos de ventas diarias y un algoritmo de pedido automático a central de compras, ajustándolo ante desviaciones; he reducido un 30 % las caducidades y un 80 % los productos sin venta durante más de un mes, sin afectar a las ventas.</w:t>
       </w:r>
     </w:p>
     <w:p>
@@ -299,7 +299,7 @@
           <w:color w:val="20242A"/>
           <w:sz w:val="18"/>
         </w:rPr>
-        <w:t>He reducido el trabajo posterior a la entrevista de 15-20 a 5 minutos, los informes al Consejo de 20 a 3 minutos y la documentación de contratación y onboarding de unos 20 minutos a generación inmediata.</w:t>
+        <w:t>He creado formularios y acciones periódicas documentadas para la limpieza y la comprobación de frenos, ruedas y otros elementos de vehículos.</w:t>
       </w:r>
     </w:p>
     <w:p>
@@ -318,7 +318,7 @@
           <w:color w:val="20242A"/>
           <w:sz w:val="18"/>
         </w:rPr>
-        <w:t>He automatizado vacaciones, días libres, permisos, envío de nóminas solicitado por el personal y registro de entradas y salidas conforme a la normativa aplicable.</w:t>
+        <w:t>He diseñado con programación propia, Trello y Notion procesos de selección, precontratación, incorporación y seguimiento; he preparado informes para el Consejo de Dirección y reducido el trabajo posterior a la entrevista de 15-20 a 5 minutos, los informes de 20 a 3 minutos y la documentación de contratación y onboarding de unos 20 minutos a generación inmediata.</w:t>
       </w:r>
     </w:p>
     <w:p>
@@ -337,7 +337,7 @@
           <w:color w:val="20242A"/>
           <w:sz w:val="18"/>
         </w:rPr>
-        <w:t>He reducido un 30 % las caducidades y un 80 % los productos sin venta durante más de un mes con un algoritmo de pedido y reposición próxima al just-in-time, sin afectar a las ventas.</w:t>
+        <w:t>He adaptado el sistema a cambios normativos de protección de datos, restringido el acceso a información personal y automatizado vacaciones, permisos, nóminas solicitadas y registro de entradas y salidas conforme a la normativa aplicable.</w:t>
       </w:r>
     </w:p>
     <w:p>

</xml_diff>

<commit_message>
docs: actualiza seguimiento de vehículos en CV
</commit_message>
<xml_diff>
--- a/boveda-entrevista-profesional/busqueda-empleo/presentacion-espontanea/cv-maestro.docx
+++ b/boveda-entrevista-profesional/busqueda-empleo/presentacion-espontanea/cv-maestro.docx
@@ -173,7 +173,7 @@
           <w:color w:val="20242A"/>
           <w:sz w:val="18"/>
         </w:rPr>
-        <w:t>He diseñado una base de datos de ventas y un algoritmo de pedido automático, ajustándolo ante desviaciones; también he creado controles periódicos documentados para la limpieza y la comprobación de vehículos.</w:t>
+        <w:t>He diseñado una base de datos de ventas y un algoritmo de pedido automático, ajustándolo ante desviaciones. He creado un sistema de seguimiento del mantenimiento de los vehículos de la empresa.</w:t>
       </w:r>
     </w:p>
     <w:p>
@@ -299,7 +299,7 @@
           <w:color w:val="20242A"/>
           <w:sz w:val="18"/>
         </w:rPr>
-        <w:t>He creado formularios y acciones periódicas documentadas para la limpieza y la comprobación de frenos, ruedas y otros elementos de vehículos.</w:t>
+        <w:t>He creado un sistema de seguimiento del mantenimiento de los vehículos de la empresa.</w:t>
       </w:r>
     </w:p>
     <w:p>

</xml_diff>

<commit_message>
docs: excluye experiencia política del CV
</commit_message>
<xml_diff>
--- a/boveda-entrevista-profesional/busqueda-empleo/presentacion-espontanea/cv-maestro.docx
+++ b/boveda-entrevista-profesional/busqueda-empleo/presentacion-espontanea/cv-maestro.docx
@@ -81,7 +81,7 @@
           <w:color w:val="20242A"/>
           <w:sz w:val="19"/>
         </w:rPr>
-        <w:t>He dirigido de forma transversal personas, operaciones, sistemas, logística y parte de la administración. He coordinado directamente a responsables de tienda y preparado informes para el Consejo de Dirección. Analizo procesos, modelo información y convierto tareas manuales en flujos documentados y automatizados; he aplicado ese enfoque al control logístico, la gestión documental, los procesos administrativos y recaudatorios y la gestión de personas.</w:t>
+        <w:t>He dirigido de forma transversal personas, operaciones, sistemas, logística y parte de la administración. He coordinado directamente a responsables de tienda y preparado informes para el Consejo de Dirección. Analizo procesos, modelo información y convierto tareas manuales en flujos documentados y automatizados; he aplicado ese enfoque al control logístico, la gestión documental, los procesos administrativos y la gestión de personas.</w:t>
       </w:r>
     </w:p>
     <w:p>
@@ -147,7 +147,7 @@
           <w:color w:val="20242A"/>
           <w:sz w:val="18"/>
         </w:rPr>
-        <w:t>He clasificado datos variables de documentos laborales, separado datos personales sujetos a protección y modelado puestos y requisitos; también he analizado presupuestos y acelerado la información presupuestaria para Tesorería e Intervención.</w:t>
+        <w:t>He clasificado datos variables de documentos laborales, separado datos personales sujetos a protección y modelado puestos y requisitos.</w:t>
       </w:r>
     </w:p>
     <w:p>
@@ -342,61 +342,6 @@
       </w:r>
     </w:p>
     <w:p>
-      <w:pPr>
-        <w:pStyle w:val="Heading2"/>
-        <w:keepNext/>
-      </w:pPr>
-      <w:r>
-        <w:rPr>
-          <w:rFonts w:ascii="Calibri" w:hAnsi="Calibri"/>
-          <w:b/>
-          <w:i w:val="0"/>
-          <w:color w:val="0B2545"/>
-          <w:sz w:val="19"/>
-        </w:rPr>
-        <w:t>INERZA, S. A.</w:t>
-      </w:r>
-      <w:r>
-        <w:rPr>
-          <w:rFonts w:ascii="Calibri" w:hAnsi="Calibri"/>
-          <w:b/>
-          <w:i w:val="0"/>
-          <w:color w:val="20242A"/>
-          <w:sz w:val="19"/>
-        </w:rPr>
-        <w:t xml:space="preserve"> | Programador</w:t>
-      </w:r>
-      <w:r>
-        <w:rPr>
-          <w:rFonts w:ascii="Calibri" w:hAnsi="Calibri"/>
-          <w:b w:val="0"/>
-          <w:i w:val="0"/>
-          <w:color w:val="5A6573"/>
-          <w:sz w:val="18"/>
-        </w:rPr>
-        <w:t xml:space="preserve">  ·  2009 - 2011</w:t>
-      </w:r>
-    </w:p>
-    <w:p>
-      <w:pPr>
-        <w:pStyle w:val="CVBullet"/>
-        <w:numPr>
-          <w:ilvl w:val="0"/>
-          <w:numId w:val="10"/>
-        </w:numPr>
-      </w:pPr>
-      <w:r>
-        <w:rPr>
-          <w:rFonts w:ascii="Calibri" w:hAnsi="Calibri"/>
-          <w:b w:val="0"/>
-          <w:i w:val="0"/>
-          <w:color w:val="20242A"/>
-          <w:sz w:val="18"/>
-        </w:rPr>
-        <w:t>He diseñado bases de datos para solicitudes de vivienda pública, clasificado datos de baremación, generado documentación oficial de cada paso y desarrollado programas de apoyo para personal funcionario.</w:t>
-      </w:r>
-    </w:p>
-    <w:p>
       <w:r>
         <w:br w:type="page"/>
       </w:r>
@@ -489,99 +434,6 @@
           <w:sz w:val="18"/>
         </w:rPr>
         <w:t>He reducido la asignación de una semana manual a 8 horas el primer año y 2 horas el segundo, más 2-3 horas de comprobación; he actualizado el algoritmo cada año según la normativa de la convocatoria.</w:t>
-      </w:r>
-    </w:p>
-    <w:p>
-      <w:pPr>
-        <w:pStyle w:val="Heading2"/>
-        <w:keepNext/>
-      </w:pPr>
-      <w:r>
-        <w:rPr>
-          <w:rFonts w:ascii="Calibri" w:hAnsi="Calibri"/>
-          <w:b/>
-          <w:i w:val="0"/>
-          <w:color w:val="0B2545"/>
-          <w:sz w:val="19"/>
-        </w:rPr>
-        <w:t>Ayuntamiento de Gáldar</w:t>
-      </w:r>
-      <w:r>
-        <w:rPr>
-          <w:rFonts w:ascii="Calibri" w:hAnsi="Calibri"/>
-          <w:b/>
-          <w:i w:val="0"/>
-          <w:color w:val="20242A"/>
-          <w:sz w:val="19"/>
-        </w:rPr>
-        <w:t xml:space="preserve"> | Concejal de Hacienda y Patrimonio</w:t>
-      </w:r>
-      <w:r>
-        <w:rPr>
-          <w:rFonts w:ascii="Calibri" w:hAnsi="Calibri"/>
-          <w:b w:val="0"/>
-          <w:i w:val="0"/>
-          <w:color w:val="5A6573"/>
-          <w:sz w:val="18"/>
-        </w:rPr>
-        <w:t xml:space="preserve">  ·  1996 - 1999</w:t>
-      </w:r>
-    </w:p>
-    <w:p>
-      <w:pPr>
-        <w:pStyle w:val="CVBullet"/>
-        <w:numPr>
-          <w:ilvl w:val="0"/>
-          <w:numId w:val="10"/>
-        </w:numPr>
-      </w:pPr>
-      <w:r>
-        <w:rPr>
-          <w:rFonts w:ascii="Calibri" w:hAnsi="Calibri"/>
-          <w:b w:val="0"/>
-          <w:i w:val="0"/>
-          <w:color w:val="20242A"/>
-          <w:sz w:val="18"/>
-        </w:rPr>
-        <w:t>He automatizado el cálculo de plusvalías para preparar el cobro al día siguiente e informatizado el apremio para generar durante la noche la documentación de notificación del día siguiente.</w:t>
-      </w:r>
-    </w:p>
-    <w:p>
-      <w:pPr>
-        <w:pStyle w:val="CVBullet"/>
-        <w:numPr>
-          <w:ilvl w:val="0"/>
-          <w:numId w:val="10"/>
-        </w:numPr>
-      </w:pPr>
-      <w:r>
-        <w:rPr>
-          <w:rFonts w:ascii="Calibri" w:hAnsi="Calibri"/>
-          <w:b w:val="0"/>
-          <w:i w:val="0"/>
-          <w:color w:val="20242A"/>
-          <w:sz w:val="18"/>
-        </w:rPr>
-        <w:t>Tras estas automatizaciones, la recaudación por apremio aumentó un 120 % en notificaciones y un 60 % en importe recaudado, y se facilitaron fraccionamientos de deuda.</w:t>
-      </w:r>
-    </w:p>
-    <w:p>
-      <w:pPr>
-        <w:pStyle w:val="CVBullet"/>
-        <w:numPr>
-          <w:ilvl w:val="0"/>
-          <w:numId w:val="10"/>
-        </w:numPr>
-      </w:pPr>
-      <w:r>
-        <w:rPr>
-          <w:rFonts w:ascii="Calibri" w:hAnsi="Calibri"/>
-          <w:b w:val="0"/>
-          <w:i w:val="0"/>
-          <w:color w:val="20242A"/>
-          <w:sz w:val="18"/>
-        </w:rPr>
-        <w:t>He negociado con entidades bancarias intereses, posibles avales para cuentas de proyectos del Cabildo y anticipos de cobro de IVTM, basura e IBI.</w:t>
       </w:r>
     </w:p>
     <w:p>

</xml_diff>

<commit_message>
docs: rehacer CV maestro de operaciones
</commit_message>
<xml_diff>
--- a/boveda-entrevista-profesional/busqueda-empleo/presentacion-espontanea/cv-maestro.docx
+++ b/boveda-entrevista-profesional/busqueda-empleo/presentacion-espontanea/cv-maestro.docx
@@ -4,15 +4,13 @@
   <w:body>
     <w:p>
       <w:pPr>
-        <w:keepNext/>
-        <w:spacing w:before="0" w:after="20"/>
+        <w:spacing w:after="20"/>
       </w:pPr>
       <w:r>
         <w:rPr>
-          <w:rFonts w:ascii="Calibri" w:hAnsi="Calibri"/>
+          <w:rFonts w:ascii="Aptos" w:hAnsi="Aptos"/>
           <w:b/>
-          <w:i w:val="0"/>
-          <w:color w:val="0B2545"/>
+          <w:color w:val="17365D"/>
           <w:sz w:val="48"/>
         </w:rPr>
         <w:t>Gustavo Vega</w:t>
@@ -20,209 +18,133 @@
     </w:p>
     <w:p>
       <w:pPr>
-        <w:keepNext/>
-        <w:spacing w:before="0" w:after="40"/>
+        <w:spacing w:after="140"/>
+        <w:pBdr>
+          <w:bottom w:val="single" w:sz="10" w:space="6" w:color="9DB7D5"/>
+        </w:pBdr>
       </w:pPr>
       <w:r>
         <w:rPr>
-          <w:rFonts w:ascii="Calibri" w:hAnsi="Calibri"/>
+          <w:rFonts w:ascii="Aptos" w:hAnsi="Aptos"/>
           <w:b/>
-          <w:i w:val="0"/>
-          <w:color w:val="2E74B5"/>
-          <w:sz w:val="21"/>
+          <w:color w:val="2E75B6"/>
+          <w:sz w:val="22"/>
         </w:rPr>
-        <w:t>Dirección (Management), Administración y Operaciones: mejora de procesos, trazabilidad y automatización</w:t>
+        <w:t>Dirección ejecutiva · Personas, procesos, sistemas y operaciones</w:t>
       </w:r>
     </w:p>
     <w:p>
       <w:pPr>
-        <w:keepNext/>
-        <w:spacing w:before="0" w:after="100"/>
-        <w:pBdr>
-          <w:bottom w:val="single" w:sz="8" w:space="3" w:color="B9C8D8"/>
-        </w:pBdr>
+        <w:pStyle w:val="CVSection"/>
       </w:pPr>
       <w:r>
         <w:rPr>
-          <w:rFonts w:ascii="Calibri" w:hAnsi="Calibri"/>
-          <w:b w:val="0"/>
-          <w:i w:val="0"/>
-          <w:color w:val="5A6573"/>
-          <w:sz w:val="18"/>
-        </w:rPr>
-        <w:t>gusvegabol@gmail.com  |  669 549 933</w:t>
-      </w:r>
-    </w:p>
-    <w:p>
-      <w:pPr>
-        <w:pStyle w:val="Heading1"/>
-        <w:keepNext/>
-      </w:pPr>
-      <w:r>
-        <w:rPr>
-          <w:rFonts w:ascii="Calibri" w:hAnsi="Calibri"/>
+          <w:rFonts w:ascii="Aptos" w:hAnsi="Aptos"/>
           <w:b/>
-          <w:i w:val="0"/>
-          <w:color w:val="2E74B5"/>
-          <w:sz w:val="23"/>
+          <w:color w:val="2E75B6"/>
+          <w:sz w:val="28"/>
         </w:rPr>
         <w:t>RESUMEN DE VALOR</w:t>
       </w:r>
     </w:p>
     <w:p>
       <w:pPr>
-        <w:keepLines/>
+        <w:pStyle w:val="CVBody"/>
       </w:pPr>
       <w:r>
         <w:rPr>
-          <w:rFonts w:ascii="Calibri" w:hAnsi="Calibri"/>
-          <w:b w:val="0"/>
-          <w:i w:val="0"/>
-          <w:color w:val="20242A"/>
-          <w:sz w:val="19"/>
+          <w:rFonts w:ascii="Aptos" w:hAnsi="Aptos"/>
+          <w:color w:val="202934"/>
+          <w:sz w:val="20"/>
         </w:rPr>
-        <w:t>He dirigido de forma transversal personas, operaciones, sistemas, logística y parte de la administración. He coordinado directamente a responsables de tienda y preparado informes para el Consejo de Dirección. Analizo procesos, modelo información y convierto tareas manuales en flujos documentados y automatizados; he aplicado ese enfoque al control logístico, la gestión documental, los procesos administrativos y la gestión de personas.</w:t>
+        <w:t>He dirigido de forma transversal personas, procesos, sistemas y operaciones; analizo procesos, modelo información y convierto tareas manuales en flujos documentados y automatizados. He aplicado este enfoque a la organización del trabajo, el aprovisionamiento, el control logístico, la gestión documental y los procesos administrativos.</w:t>
       </w:r>
     </w:p>
     <w:p>
       <w:pPr>
-        <w:pStyle w:val="Heading1"/>
-        <w:keepNext/>
+        <w:pStyle w:val="CVSection"/>
       </w:pPr>
       <w:r>
         <w:rPr>
-          <w:rFonts w:ascii="Calibri" w:hAnsi="Calibri"/>
+          <w:rFonts w:ascii="Aptos" w:hAnsi="Aptos"/>
           <w:b/>
-          <w:i w:val="0"/>
-          <w:color w:val="2E74B5"/>
-          <w:sz w:val="23"/>
+          <w:color w:val="2E75B6"/>
+          <w:sz w:val="28"/>
         </w:rPr>
         <w:t>ÁREAS DE CONTRIBUCIÓN</w:t>
       </w:r>
     </w:p>
     <w:p>
       <w:pPr>
-        <w:pStyle w:val="CVArea"/>
+        <w:pStyle w:val="CVBody"/>
       </w:pPr>
       <w:r>
         <w:rPr>
-          <w:rFonts w:ascii="Calibri" w:hAnsi="Calibri"/>
-          <w:b/>
-          <w:i w:val="0"/>
-          <w:color w:val="1F4D78"/>
-          <w:sz w:val="18"/>
+          <w:rFonts w:ascii="Aptos" w:hAnsi="Aptos"/>
+          <w:color w:val="202934"/>
+          <w:sz w:val="20"/>
         </w:rPr>
-        <w:t xml:space="preserve">Dirección (Management). </w:t>
-      </w:r>
-      <w:r>
-        <w:rPr>
-          <w:rFonts w:ascii="Calibri" w:hAnsi="Calibri"/>
-          <w:b w:val="0"/>
-          <w:i w:val="0"/>
-          <w:color w:val="20242A"/>
-          <w:sz w:val="18"/>
-        </w:rPr>
-        <w:t>He asumido responsabilidades simultáneas en RR. HH., IT, operaciones, logística y parte de administración; he coordinado directamente a responsables de tienda, mantenido entrevistas semanales y un canal de puerta abierta con el personal, y preparado informes para el Consejo de Dirección.</w:t>
+        <w:t>Dirección y operaciones. He reorganizado el trabajo en equipos polivalentes por tienda para que las secciones se apoyaran según necesidad.</w:t>
       </w:r>
     </w:p>
     <w:p>
       <w:pPr>
-        <w:pStyle w:val="CVArea"/>
+        <w:pStyle w:val="CVBody"/>
       </w:pPr>
       <w:r>
         <w:rPr>
-          <w:rFonts w:ascii="Calibri" w:hAnsi="Calibri"/>
-          <w:b/>
-          <w:i w:val="0"/>
-          <w:color w:val="1F4D78"/>
-          <w:sz w:val="18"/>
+          <w:rFonts w:ascii="Aptos" w:hAnsi="Aptos"/>
+          <w:color w:val="202934"/>
+          <w:sz w:val="20"/>
         </w:rPr>
-        <w:t xml:space="preserve">Administración. </w:t>
-      </w:r>
-      <w:r>
-        <w:rPr>
-          <w:rFonts w:ascii="Calibri" w:hAnsi="Calibri"/>
-          <w:b w:val="0"/>
-          <w:i w:val="0"/>
-          <w:color w:val="20242A"/>
-          <w:sz w:val="18"/>
-        </w:rPr>
-        <w:t>He clasificado datos variables de documentos laborales, separado datos personales sujetos a protección y modelado puestos y requisitos.</w:t>
+        <w:t>Sistemas y datos. He diseñado bases de datos, algoritmos de pedido y análisis de datos de clientes, ajustando los modelos cuando detectaba desviaciones.</w:t>
       </w:r>
     </w:p>
     <w:p>
       <w:pPr>
-        <w:pStyle w:val="CVArea"/>
+        <w:pStyle w:val="CVBody"/>
       </w:pPr>
       <w:r>
         <w:rPr>
-          <w:rFonts w:ascii="Calibri" w:hAnsi="Calibri"/>
-          <w:b/>
-          <w:i w:val="0"/>
-          <w:color w:val="1F4D78"/>
-          <w:sz w:val="18"/>
+          <w:rFonts w:ascii="Aptos" w:hAnsi="Aptos"/>
+          <w:color w:val="202934"/>
+          <w:sz w:val="20"/>
         </w:rPr>
-        <w:t xml:space="preserve">Operaciones. </w:t>
-      </w:r>
-      <w:r>
-        <w:rPr>
-          <w:rFonts w:ascii="Calibri" w:hAnsi="Calibri"/>
-          <w:b w:val="0"/>
-          <w:i w:val="0"/>
-          <w:color w:val="20242A"/>
-          <w:sz w:val="18"/>
-        </w:rPr>
-        <w:t>He diseñado una base de datos de ventas y un algoritmo de pedido automático, ajustándolo ante desviaciones. He creado un sistema de seguimiento del mantenimiento de los vehículos de la empresa.</w:t>
+        <w:t>Administración y trazabilidad. He modelado puestos y requisitos, separado datos personales sujetos a protección y automatizado flujos documentales.</w:t>
       </w:r>
     </w:p>
     <w:p>
       <w:pPr>
-        <w:pStyle w:val="Heading1"/>
-        <w:keepNext/>
+        <w:pStyle w:val="CVSection"/>
       </w:pPr>
       <w:r>
         <w:rPr>
-          <w:rFonts w:ascii="Calibri" w:hAnsi="Calibri"/>
+          <w:rFonts w:ascii="Aptos" w:hAnsi="Aptos"/>
           <w:b/>
-          <w:i w:val="0"/>
-          <w:color w:val="2E74B5"/>
-          <w:sz w:val="23"/>
+          <w:color w:val="2E75B6"/>
+          <w:sz w:val="28"/>
         </w:rPr>
         <w:t>EXPERIENCIA PROFESIONAL</w:t>
       </w:r>
     </w:p>
     <w:p>
       <w:pPr>
-        <w:pStyle w:val="Heading2"/>
-        <w:keepNext/>
+        <w:pStyle w:val="CVRole"/>
       </w:pPr>
       <w:r>
         <w:rPr>
-          <w:rFonts w:ascii="Calibri" w:hAnsi="Calibri"/>
+          <w:rFonts w:ascii="Aptos" w:hAnsi="Aptos"/>
           <w:b/>
-          <w:i w:val="0"/>
-          <w:color w:val="0B2545"/>
-          <w:sz w:val="19"/>
+          <w:color w:val="17365D"/>
+          <w:sz w:val="22"/>
         </w:rPr>
-        <w:t>Herfrailes S. L.</w:t>
+        <w:t>Herfrailes S. L. | Director Ejecutivo</w:t>
       </w:r>
       <w:r>
         <w:rPr>
-          <w:rFonts w:ascii="Calibri" w:hAnsi="Calibri"/>
-          <w:b/>
-          <w:i w:val="0"/>
-          <w:color w:val="20242A"/>
-          <w:sz w:val="19"/>
-        </w:rPr>
-        <w:t xml:space="preserve"> | Director Ejecutivo</w:t>
-      </w:r>
-      <w:r>
-        <w:rPr>
-          <w:rFonts w:ascii="Calibri" w:hAnsi="Calibri"/>
-          <w:b w:val="0"/>
-          <w:i w:val="0"/>
-          <w:color w:val="5A6573"/>
-          <w:sz w:val="18"/>
+          <w:rFonts w:ascii="Aptos" w:hAnsi="Aptos"/>
+          <w:color w:val="5F6B7A"/>
+          <w:sz w:val="22"/>
         </w:rPr>
         <w:t xml:space="preserve">  ·  01/10/2011 - 03/10/2024</w:t>
       </w:r>
@@ -230,75 +152,51 @@
     <w:p>
       <w:pPr>
         <w:pStyle w:val="CVBullet"/>
-        <w:numPr>
-          <w:ilvl w:val="0"/>
-          <w:numId w:val="10"/>
-        </w:numPr>
       </w:pPr>
       <w:r>
         <w:rPr>
-          <w:rFonts w:ascii="Calibri" w:hAnsi="Calibri"/>
-          <w:b w:val="0"/>
-          <w:i w:val="0"/>
-          <w:color w:val="20242A"/>
-          <w:sz w:val="18"/>
+          <w:rFonts w:ascii="Aptos" w:hAnsi="Aptos"/>
+          <w:color w:val="202934"/>
+          <w:sz w:val="20"/>
         </w:rPr>
-        <w:t>He asumido responsabilidades simultáneas en RR. HH., IT, operaciones, logística y parte de administración.</w:t>
+        <w:t>He asumido responsabilidades simultáneas en personas, IT, operaciones, logística y parte de administración, conectando necesidades de negocio, información y ejecución.</w:t>
       </w:r>
     </w:p>
     <w:p>
       <w:pPr>
         <w:pStyle w:val="CVBullet"/>
-        <w:numPr>
-          <w:ilvl w:val="0"/>
-          <w:numId w:val="10"/>
-        </w:numPr>
       </w:pPr>
       <w:r>
         <w:rPr>
-          <w:rFonts w:ascii="Calibri" w:hAnsi="Calibri"/>
-          <w:b w:val="0"/>
-          <w:i w:val="0"/>
-          <w:color w:val="20242A"/>
-          <w:sz w:val="18"/>
+          <w:rFonts w:ascii="Aptos" w:hAnsi="Aptos"/>
+          <w:color w:val="202934"/>
+          <w:sz w:val="20"/>
         </w:rPr>
-        <w:t>He coordinado directamente a responsables de tienda, mantenido entrevistas semanales y un canal de puerta abierta con el personal.</w:t>
+        <w:t>He rediseñado la organización del trabajo en equipos polivalentes por tienda, reubicando y ajustando la plantilla conforme a la carga de trabajo detectada.</w:t>
       </w:r>
     </w:p>
     <w:p>
       <w:pPr>
         <w:pStyle w:val="CVBullet"/>
-        <w:numPr>
-          <w:ilvl w:val="0"/>
-          <w:numId w:val="10"/>
-        </w:numPr>
       </w:pPr>
       <w:r>
         <w:rPr>
-          <w:rFonts w:ascii="Calibri" w:hAnsi="Calibri"/>
-          <w:b w:val="0"/>
-          <w:i w:val="0"/>
-          <w:color w:val="20242A"/>
-          <w:sz w:val="18"/>
+          <w:rFonts w:ascii="Aptos" w:hAnsi="Aptos"/>
+          <w:color w:val="202934"/>
+          <w:sz w:val="20"/>
         </w:rPr>
-        <w:t>He diseñado una base de datos de ventas diarias y un algoritmo de pedido automático a central de compras, ajustándolo ante desviaciones; he reducido un 30 % las caducidades y un 80 % los productos sin venta durante más de un mes, sin afectar a las ventas.</w:t>
+        <w:t>He diseñado una base de datos de ventas diarias y un algoritmo de pedido automático a central de compras; al analizar desviaciones, reduje un 30 % las caducidades y un 80 % los productos sin venta durante más de un mes, sin afectar a las ventas.</w:t>
       </w:r>
     </w:p>
     <w:p>
       <w:pPr>
         <w:pStyle w:val="CVBullet"/>
-        <w:numPr>
-          <w:ilvl w:val="0"/>
-          <w:numId w:val="10"/>
-        </w:numPr>
       </w:pPr>
       <w:r>
         <w:rPr>
-          <w:rFonts w:ascii="Calibri" w:hAnsi="Calibri"/>
-          <w:b w:val="0"/>
-          <w:i w:val="0"/>
-          <w:color w:val="20242A"/>
-          <w:sz w:val="18"/>
+          <w:rFonts w:ascii="Aptos" w:hAnsi="Aptos"/>
+          <w:color w:val="202934"/>
+          <w:sz w:val="20"/>
         </w:rPr>
         <w:t>He creado un sistema de seguimiento del mantenimiento de los vehículos de la empresa.</w:t>
       </w:r>
@@ -306,39 +204,40 @@
     <w:p>
       <w:pPr>
         <w:pStyle w:val="CVBullet"/>
-        <w:numPr>
-          <w:ilvl w:val="0"/>
-          <w:numId w:val="10"/>
-        </w:numPr>
       </w:pPr>
       <w:r>
         <w:rPr>
-          <w:rFonts w:ascii="Calibri" w:hAnsi="Calibri"/>
-          <w:b w:val="0"/>
-          <w:i w:val="0"/>
-          <w:color w:val="20242A"/>
-          <w:sz w:val="18"/>
+          <w:rFonts w:ascii="Aptos" w:hAnsi="Aptos"/>
+          <w:color w:val="202934"/>
+          <w:sz w:val="20"/>
         </w:rPr>
-        <w:t>He diseñado con programación propia, Trello y Notion procesos de selección, precontratación, incorporación y seguimiento; he preparado informes para el Consejo de Dirección y reducido el trabajo posterior a la entrevista de 15-20 a 5 minutos, los informes de 20 a 3 minutos y la documentación de contratación y onboarding de unos 20 minutos a generación inmediata.</w:t>
+        <w:t>He diseñado y coordinado dos campañas de recogida de datos de procedencia de clientes para delimitar la zona de influencia de las tiendas; el análisis identificó que el 42 % de la clientela de la tienda grande procedía de la zona en riesgo ante una nueva competencia.</w:t>
       </w:r>
     </w:p>
     <w:p>
       <w:pPr>
         <w:pStyle w:val="CVBullet"/>
-        <w:numPr>
-          <w:ilvl w:val="0"/>
-          <w:numId w:val="10"/>
-        </w:numPr>
       </w:pPr>
       <w:r>
         <w:rPr>
-          <w:rFonts w:ascii="Calibri" w:hAnsi="Calibri"/>
-          <w:b w:val="0"/>
-          <w:i w:val="0"/>
-          <w:color w:val="20242A"/>
-          <w:sz w:val="18"/>
+          <w:rFonts w:ascii="Aptos" w:hAnsi="Aptos"/>
+          <w:color w:val="202934"/>
+          <w:sz w:val="20"/>
         </w:rPr>
-        <w:t>He adaptado el sistema a cambios normativos de protección de datos, restringido el acceso a información personal y automatizado vacaciones, permisos, nóminas solicitadas y registro de entradas y salidas conforme a la normativa aplicable.</w:t>
+        <w:t>He diseñado con programación propia, Trello y Notion procesos de selección, precontratación, incorporación y seguimiento; reduje el trabajo posterior a la entrevista de 15-20 a 5 minutos, los informes para el Consejo de 20 a 3 minutos y la documentación de contratación y acogida a generación inmediata.</w:t>
+      </w:r>
+    </w:p>
+    <w:p>
+      <w:pPr>
+        <w:pStyle w:val="CVBullet"/>
+      </w:pPr>
+      <w:r>
+        <w:rPr>
+          <w:rFonts w:ascii="Aptos" w:hAnsi="Aptos"/>
+          <w:color w:val="202934"/>
+          <w:sz w:val="20"/>
+        </w:rPr>
+        <w:t>He adaptado el sistema a cambios normativos de protección de datos, restringido el acceso a información personal y automatizado vacaciones, permisos, nóminas solicitadas y el registro de entradas y salidas conforme a la normativa aplicable.</w:t>
       </w:r>
     </w:p>
     <w:p>
@@ -348,126 +247,36 @@
     </w:p>
     <w:p>
       <w:pPr>
-        <w:pStyle w:val="Heading1"/>
-        <w:keepNext/>
+        <w:pStyle w:val="CVSection"/>
       </w:pPr>
       <w:r>
         <w:rPr>
-          <w:rFonts w:ascii="Calibri" w:hAnsi="Calibri"/>
+          <w:rFonts w:ascii="Aptos" w:hAnsi="Aptos"/>
           <w:b/>
-          <w:i w:val="0"/>
-          <w:color w:val="2E74B5"/>
-          <w:sz w:val="23"/>
+          <w:color w:val="2E75B6"/>
+          <w:sz w:val="28"/>
         </w:rPr>
         <w:t>EXPERIENCIA PROFESIONAL - CONTINUACIÓN</w:t>
       </w:r>
     </w:p>
     <w:p>
       <w:pPr>
-        <w:pStyle w:val="Heading2"/>
-        <w:keepNext/>
+        <w:pStyle w:val="CVRole"/>
       </w:pPr>
       <w:r>
         <w:rPr>
-          <w:rFonts w:ascii="Calibri" w:hAnsi="Calibri"/>
+          <w:rFonts w:ascii="Aptos" w:hAnsi="Aptos"/>
           <w:b/>
-          <w:i w:val="0"/>
-          <w:color w:val="0B2545"/>
-          <w:sz w:val="19"/>
+          <w:color w:val="17365D"/>
+          <w:sz w:val="22"/>
         </w:rPr>
-        <w:t>General de Software de Canarias, S. A. U.</w:t>
+        <w:t>Granintra S. A. | Analista programador</w:t>
       </w:r>
       <w:r>
         <w:rPr>
-          <w:rFonts w:ascii="Calibri" w:hAnsi="Calibri"/>
-          <w:b/>
-          <w:i w:val="0"/>
-          <w:color w:val="20242A"/>
-          <w:sz w:val="19"/>
-        </w:rPr>
-        <w:t xml:space="preserve"> | Analista programador</w:t>
-      </w:r>
-      <w:r>
-        <w:rPr>
-          <w:rFonts w:ascii="Calibri" w:hAnsi="Calibri"/>
-          <w:b w:val="0"/>
-          <w:i w:val="0"/>
-          <w:color w:val="5A6573"/>
-          <w:sz w:val="18"/>
-        </w:rPr>
-        <w:t xml:space="preserve">  ·  2001 - 2009</w:t>
-      </w:r>
-    </w:p>
-    <w:p>
-      <w:pPr>
-        <w:pStyle w:val="CVBullet"/>
-        <w:numPr>
-          <w:ilvl w:val="0"/>
-          <w:numId w:val="10"/>
-        </w:numPr>
-      </w:pPr>
-      <w:r>
-        <w:rPr>
-          <w:rFonts w:ascii="Calibri" w:hAnsi="Calibri"/>
-          <w:b w:val="0"/>
-          <w:i w:val="0"/>
-          <w:color w:val="20242A"/>
-          <w:sz w:val="18"/>
-        </w:rPr>
-        <w:t>He creado un algoritmo de adjudicación de plazas de profesorado con antigüedad, situación de plaza, comisiones de servicio y liberación iterativa de plazas según el orden de lista.</w:t>
-      </w:r>
-    </w:p>
-    <w:p>
-      <w:pPr>
-        <w:pStyle w:val="CVBullet"/>
-        <w:numPr>
-          <w:ilvl w:val="0"/>
-          <w:numId w:val="10"/>
-        </w:numPr>
-      </w:pPr>
-      <w:r>
-        <w:rPr>
-          <w:rFonts w:ascii="Calibri" w:hAnsi="Calibri"/>
-          <w:b w:val="0"/>
-          <w:i w:val="0"/>
-          <w:color w:val="20242A"/>
-          <w:sz w:val="18"/>
-        </w:rPr>
-        <w:t>He reducido la asignación de una semana manual a 8 horas el primer año y 2 horas el segundo, más 2-3 horas de comprobación; he actualizado el algoritmo cada año según la normativa de la convocatoria.</w:t>
-      </w:r>
-    </w:p>
-    <w:p>
-      <w:pPr>
-        <w:pStyle w:val="Heading2"/>
-        <w:keepNext/>
-      </w:pPr>
-      <w:r>
-        <w:rPr>
-          <w:rFonts w:ascii="Calibri" w:hAnsi="Calibri"/>
-          <w:b/>
-          <w:i w:val="0"/>
-          <w:color w:val="0B2545"/>
-          <w:sz w:val="19"/>
-        </w:rPr>
-        <w:t>Granintra S. A.</w:t>
-      </w:r>
-      <w:r>
-        <w:rPr>
-          <w:rFonts w:ascii="Calibri" w:hAnsi="Calibri"/>
-          <w:b/>
-          <w:i w:val="0"/>
-          <w:color w:val="20242A"/>
-          <w:sz w:val="19"/>
-        </w:rPr>
-        <w:t xml:space="preserve"> | Analista programador</w:t>
-      </w:r>
-      <w:r>
-        <w:rPr>
-          <w:rFonts w:ascii="Calibri" w:hAnsi="Calibri"/>
-          <w:b w:val="0"/>
-          <w:i w:val="0"/>
-          <w:color w:val="5A6573"/>
-          <w:sz w:val="18"/>
+          <w:rFonts w:ascii="Aptos" w:hAnsi="Aptos"/>
+          <w:color w:val="5F6B7A"/>
+          <w:sz w:val="22"/>
         </w:rPr>
         <w:t xml:space="preserve">  ·  1990 - 1996</w:t>
       </w:r>
@@ -475,18 +284,12 @@
     <w:p>
       <w:pPr>
         <w:pStyle w:val="CVBullet"/>
-        <w:numPr>
-          <w:ilvl w:val="0"/>
-          <w:numId w:val="10"/>
-        </w:numPr>
       </w:pPr>
       <w:r>
         <w:rPr>
-          <w:rFonts w:ascii="Calibri" w:hAnsi="Calibri"/>
-          <w:b w:val="0"/>
-          <w:i w:val="0"/>
-          <w:color w:val="20242A"/>
-          <w:sz w:val="18"/>
+          <w:rFonts w:ascii="Aptos" w:hAnsi="Aptos"/>
+          <w:color w:val="202934"/>
+          <w:sz w:val="20"/>
         </w:rPr>
         <w:t>He implantado el análisis recibido para un sistema a medida de consignataria, naviera y carga y descarga de áridos, y he dirigido a dos programadores con hitos supervisados por una empresa externa.</w:t>
       </w:r>
@@ -494,18 +297,12 @@
     <w:p>
       <w:pPr>
         <w:pStyle w:val="CVBullet"/>
-        <w:numPr>
-          <w:ilvl w:val="0"/>
-          <w:numId w:val="10"/>
-        </w:numPr>
       </w:pPr>
       <w:r>
         <w:rPr>
-          <w:rFonts w:ascii="Calibri" w:hAnsi="Calibri"/>
-          <w:b w:val="0"/>
-          <w:i w:val="0"/>
-          <w:color w:val="20242A"/>
-          <w:sz w:val="18"/>
+          <w:rFonts w:ascii="Aptos" w:hAnsi="Aptos"/>
+          <w:color w:val="202934"/>
+          <w:sz w:val="20"/>
         </w:rPr>
         <w:t>He analizado e implantado la facturación de la zona de carga y descarga de áridos.</w:t>
       </w:r>
@@ -513,136 +310,119 @@
     <w:p>
       <w:pPr>
         <w:pStyle w:val="CVBullet"/>
-        <w:numPr>
-          <w:ilvl w:val="0"/>
-          <w:numId w:val="10"/>
-        </w:numPr>
       </w:pPr>
       <w:r>
         <w:rPr>
-          <w:rFonts w:ascii="Calibri" w:hAnsi="Calibri"/>
-          <w:b w:val="0"/>
-          <w:i w:val="0"/>
-          <w:color w:val="20242A"/>
-          <w:sz w:val="18"/>
+          <w:rFonts w:ascii="Aptos" w:hAnsi="Aptos"/>
+          <w:color w:val="202934"/>
+          <w:sz w:val="20"/>
         </w:rPr>
-        <w:t>He entregado la aplicación dentro del plazo de un año y posteriormente he desarrollado el seguimiento de camiones que entraban y cargaban en el muelle.</w:t>
+        <w:t>He entregado la aplicación dentro del plazo de un año y posteriormente he desarrollado funciones de seguimiento de camiones que entraban y cargaban en el muelle.</w:t>
       </w:r>
     </w:p>
     <w:p>
       <w:pPr>
-        <w:pStyle w:val="Heading1"/>
-        <w:keepNext/>
+        <w:pStyle w:val="CVSection"/>
       </w:pPr>
       <w:r>
         <w:rPr>
-          <w:rFonts w:ascii="Calibri" w:hAnsi="Calibri"/>
+          <w:rFonts w:ascii="Aptos" w:hAnsi="Aptos"/>
           <w:b/>
-          <w:i w:val="0"/>
-          <w:color w:val="2E74B5"/>
-          <w:sz w:val="23"/>
+          <w:color w:val="2E75B6"/>
+          <w:sz w:val="28"/>
         </w:rPr>
-        <w:t>COMPETENCIAS Y HERRAMIENTAS CONFIRMADAS</w:t>
+        <w:t>COMPETENCIAS Y HERRAMIENTAS</w:t>
       </w:r>
     </w:p>
     <w:p>
       <w:pPr>
-        <w:keepLines/>
+        <w:pStyle w:val="CVBody"/>
       </w:pPr>
       <w:r>
         <w:rPr>
-          <w:rFonts w:ascii="Calibri" w:hAnsi="Calibri"/>
-          <w:b w:val="0"/>
-          <w:i w:val="0"/>
-          <w:color w:val="20242A"/>
-          <w:sz w:val="18"/>
+          <w:rFonts w:ascii="Aptos" w:hAnsi="Aptos"/>
+          <w:color w:val="202934"/>
+          <w:sz w:val="20"/>
         </w:rPr>
-        <w:t>He trabajado con Notion, ChatGPT, Codex, Work, Ollama, Obsidian, Trello, Office 365, SQL Server, Microsoft Visual Studio, Windows 11, VB.NET y Windows Server.</w:t>
+        <w:t>Dirección transversal de operaciones; análisis de procesos y requisitos; modelado de datos y documentación; automatización administrativa y operativa; diseño de algoritmos de previsión y control; trazabilidad documental y protección de datos.</w:t>
       </w:r>
     </w:p>
     <w:p>
       <w:pPr>
-        <w:pStyle w:val="Heading1"/>
-        <w:keepNext/>
+        <w:pStyle w:val="CVBody"/>
       </w:pPr>
       <w:r>
         <w:rPr>
-          <w:rFonts w:ascii="Calibri" w:hAnsi="Calibri"/>
+          <w:rFonts w:ascii="Aptos" w:hAnsi="Aptos"/>
+          <w:color w:val="202934"/>
+          <w:sz w:val="20"/>
+        </w:rPr>
+        <w:t>Notion, ChatGPT, Codex, Work, Ollama, Obsidian, Trello, Office 365, SQL Server, Microsoft Visual Studio, Windows 11, VB.NET y Windows Server.</w:t>
+      </w:r>
+    </w:p>
+    <w:p>
+      <w:pPr>
+        <w:pStyle w:val="CVSection"/>
+      </w:pPr>
+      <w:r>
+        <w:rPr>
+          <w:rFonts w:ascii="Aptos" w:hAnsi="Aptos"/>
           <w:b/>
-          <w:i w:val="0"/>
-          <w:color w:val="2E74B5"/>
-          <w:sz w:val="23"/>
+          <w:color w:val="2E75B6"/>
+          <w:sz w:val="28"/>
         </w:rPr>
         <w:t>FORMACIÓN</w:t>
       </w:r>
     </w:p>
     <w:p>
       <w:pPr>
-        <w:keepLines/>
+        <w:pStyle w:val="CVBody"/>
       </w:pPr>
       <w:r>
         <w:rPr>
-          <w:rFonts w:ascii="Calibri" w:hAnsi="Calibri"/>
-          <w:b w:val="0"/>
-          <w:i w:val="0"/>
-          <w:color w:val="20242A"/>
-          <w:sz w:val="18"/>
+          <w:rFonts w:ascii="Aptos" w:hAnsi="Aptos"/>
+          <w:color w:val="202934"/>
+          <w:sz w:val="20"/>
         </w:rPr>
-        <w:t>Máster en Inteligencia Artificial con Certificación Universitaria — BIG school, con certificado de la Universidad Isabel I, en curso.</w:t>
+        <w:t>Máster en Inteligencia Artificial con Certificación Universitaria — BIG school, con certificado de la Universidad Isabel I. En curso.</w:t>
       </w:r>
     </w:p>
     <w:p>
       <w:pPr>
-        <w:keepLines/>
+        <w:pStyle w:val="CVBody"/>
       </w:pPr>
       <w:r>
         <w:rPr>
-          <w:rFonts w:ascii="Calibri" w:hAnsi="Calibri"/>
-          <w:b/>
-          <w:i w:val="0"/>
-          <w:color w:val="1F4D78"/>
-          <w:sz w:val="18"/>
+          <w:rFonts w:ascii="Aptos" w:hAnsi="Aptos"/>
+          <w:color w:val="202934"/>
+          <w:sz w:val="20"/>
         </w:rPr>
-        <w:t xml:space="preserve">Formación complementaria. </w:t>
-      </w:r>
-      <w:r>
-        <w:rPr>
-          <w:rFonts w:ascii="Calibri" w:hAnsi="Calibri"/>
-          <w:b w:val="0"/>
-          <w:i w:val="0"/>
-          <w:color w:val="20242A"/>
-          <w:sz w:val="18"/>
-        </w:rPr>
-        <w:t>Liderazgo en tiempos de cambio; Liderazgo y Gestión de Equipos de Alto Rendimiento; Innovación y emprendimiento.</w:t>
+        <w:t>Formación complementaria: Liderazgo en tiempos de cambio; Liderazgo y Gestión de Equipos de Alto Rendimiento; Innovación y emprendimiento.</w:t>
       </w:r>
     </w:p>
     <w:p>
       <w:pPr>
-        <w:pStyle w:val="Heading1"/>
-        <w:keepNext/>
+        <w:pStyle w:val="CVSection"/>
       </w:pPr>
       <w:r>
         <w:rPr>
-          <w:rFonts w:ascii="Calibri" w:hAnsi="Calibri"/>
+          <w:rFonts w:ascii="Aptos" w:hAnsi="Aptos"/>
           <w:b/>
-          <w:i w:val="0"/>
-          <w:color w:val="2E74B5"/>
-          <w:sz w:val="23"/>
+          <w:color w:val="2E75B6"/>
+          <w:sz w:val="28"/>
         </w:rPr>
         <w:t>IDIOMAS</w:t>
       </w:r>
     </w:p>
     <w:p>
       <w:pPr>
-        <w:keepLines/>
+        <w:pStyle w:val="CVBody"/>
       </w:pPr>
       <w:r>
         <w:rPr>
-          <w:rFonts w:ascii="Calibri" w:hAnsi="Calibri"/>
-          <w:b w:val="0"/>
-          <w:i w:val="0"/>
-          <w:color w:val="20242A"/>
-          <w:sz w:val="18"/>
+          <w:rFonts w:ascii="Aptos" w:hAnsi="Aptos"/>
+          <w:color w:val="202934"/>
+          <w:sz w:val="20"/>
         </w:rPr>
         <w:t>Español nativo; inglés básico en conversación y lectura técnica funcional con apoyo de herramientas cuando sea necesario.</w:t>
       </w:r>
@@ -650,7 +430,7 @@
     <w:sectPr>
       <w:footerReference w:type="default" r:id="rId9"/>
       <w:pgSz w:w="12240" w:h="15840"/>
-      <w:pgMar w:top="1440" w:right="1440" w:bottom="1440" w:left="1440" w:header="708" w:footer="708" w:gutter="0"/>
+      <w:pgMar w:top="1037" w:right="1181" w:bottom="1037" w:left="1181" w:header="720" w:footer="504" w:gutter="0"/>
       <w:cols w:space="720"/>
       <w:docGrid w:linePitch="360"/>
     </w:sectPr>
@@ -663,55 +443,42 @@
   <w:p>
     <w:pPr>
       <w:pStyle w:val="Footer"/>
-      <w:spacing w:before="0" w:after="0"/>
       <w:jc w:val="right"/>
     </w:pPr>
     <w:r>
       <w:rPr>
-        <w:rFonts w:ascii="Calibri" w:hAnsi="Calibri"/>
-        <w:b w:val="0"/>
-        <w:i w:val="0"/>
-        <w:color w:val="5A6573"/>
-        <w:sz w:val="16"/>
+        <w:rFonts w:ascii="Aptos" w:hAnsi="Aptos"/>
+        <w:color w:val="5F6B7A"/>
+        <w:sz w:val="17"/>
       </w:rPr>
       <w:t xml:space="preserve">Página </w:t>
     </w:r>
     <w:r>
       <w:rPr>
-        <w:rFonts w:ascii="Calibri" w:hAnsi="Calibri"/>
-        <w:b w:val="0"/>
-        <w:i w:val="0"/>
-        <w:color w:val="5A6573"/>
-        <w:sz w:val="16"/>
+        <w:rFonts w:ascii="Aptos" w:hAnsi="Aptos"/>
+        <w:color w:val="5F6B7A"/>
+        <w:sz w:val="17"/>
       </w:rPr>
       <w:fldChar w:fldCharType="begin"/>
       <w:instrText xml:space="preserve">PAGE</w:instrText>
-      <w:fldChar w:fldCharType="separate"/>
-      <w:t>1</w:t>
       <w:fldChar w:fldCharType="end"/>
     </w:r>
     <w:r>
       <w:rPr>
-        <w:rFonts w:ascii="Calibri" w:hAnsi="Calibri"/>
-        <w:b w:val="0"/>
-        <w:i w:val="0"/>
-        <w:color w:val="5A6573"/>
-        <w:sz w:val="16"/>
+        <w:rFonts w:ascii="Aptos" w:hAnsi="Aptos"/>
+        <w:color w:val="5F6B7A"/>
+        <w:sz w:val="17"/>
       </w:rPr>
       <w:t xml:space="preserve"> de </w:t>
     </w:r>
     <w:r>
       <w:rPr>
-        <w:rFonts w:ascii="Calibri" w:hAnsi="Calibri"/>
-        <w:b w:val="0"/>
-        <w:i w:val="0"/>
-        <w:color w:val="5A6573"/>
-        <w:sz w:val="16"/>
+        <w:rFonts w:ascii="Aptos" w:hAnsi="Aptos"/>
+        <w:color w:val="5F6B7A"/>
+        <w:sz w:val="17"/>
       </w:rPr>
       <w:fldChar w:fldCharType="begin"/>
       <w:instrText xml:space="preserve">NUMPAGES</w:instrText>
-      <w:fldChar w:fldCharType="separate"/>
-      <w:t>1</w:t>
       <w:fldChar w:fldCharType="end"/>
     </w:r>
   </w:p>
@@ -917,27 +684,6 @@
   </w:num>
   <w:num w:numId="9">
     <w:abstractNumId w:val="0"/>
-  </w:num>
-  <w:abstractNum w:abstractNumId="9">
-    <w:multiLevelType w:val="singleLevel"/>
-    <w:lvl w:ilvl="0">
-      <w:start w:val="1"/>
-      <w:numFmt w:val="bullet"/>
-      <w:lvlText w:val="•"/>
-      <w:lvlJc w:val="left"/>
-      <w:pPr>
-        <w:tabs>
-          <w:tab w:val="num" w:pos="540"/>
-        </w:tabs>
-        <w:ind w:left="540" w:hanging="270"/>
-      </w:pPr>
-      <w:rPr>
-        <w:rFonts w:ascii="Calibri" w:hAnsi="Calibri"/>
-      </w:rPr>
-    </w:lvl>
-  </w:abstractNum>
-  <w:num w:numId="10">
-    <w:abstractNumId w:val="9"/>
   </w:num>
 </w:numbering>
 </file>
@@ -1103,13 +849,12 @@
     <w:qFormat/>
     <w:rsid w:val="00FC693F"/>
     <w:pPr>
-      <w:spacing w:before="0" w:after="50" w:line="252" w:lineRule="auto"/>
+      <w:spacing w:after="80" w:line="259" w:lineRule="auto"/>
     </w:pPr>
     <w:rPr>
-      <w:rFonts w:ascii="Calibri" w:hAnsi="Calibri"/>
-      <w:b w:val="0"/>
-      <w:color w:val="20242A"/>
-      <w:sz w:val="19"/>
+      <w:rFonts w:ascii="Aptos" w:hAnsi="Aptos"/>
+      <w:color w:val="202934"/>
+      <w:sz w:val="20"/>
     </w:rPr>
   </w:style>
   <w:style w:type="paragraph" w:styleId="Header">
@@ -1167,15 +912,15 @@
     <w:pPr>
       <w:keepNext/>
       <w:keepLines/>
-      <w:spacing w:before="140" w:after="60" w:line="240" w:lineRule="auto"/>
+      <w:spacing w:before="480" w:after="0"/>
       <w:outlineLvl w:val="0"/>
     </w:pPr>
     <w:rPr>
-      <w:rFonts w:asciiTheme="majorHAnsi" w:eastAsiaTheme="majorEastAsia" w:hAnsiTheme="majorHAnsi" w:cstheme="majorBidi" w:ascii="Calibri" w:hAnsi="Calibri"/>
+      <w:rFonts w:asciiTheme="majorHAnsi" w:eastAsiaTheme="majorEastAsia" w:hAnsiTheme="majorHAnsi" w:cstheme="majorBidi"/>
       <w:b/>
       <w:bCs/>
-      <w:color w:val="2E74B5"/>
-      <w:sz w:val="23"/>
+      <w:color w:val="365F91" w:themeColor="accent1" w:themeShade="BF"/>
+      <w:sz w:val="28"/>
       <w:szCs w:val="28"/>
     </w:rPr>
   </w:style>
@@ -1191,15 +936,15 @@
     <w:pPr>
       <w:keepNext/>
       <w:keepLines/>
-      <w:spacing w:before="100" w:after="30" w:line="240" w:lineRule="auto"/>
+      <w:spacing w:before="200" w:after="0"/>
       <w:outlineLvl w:val="1"/>
     </w:pPr>
     <w:rPr>
-      <w:rFonts w:asciiTheme="majorHAnsi" w:eastAsiaTheme="majorEastAsia" w:hAnsiTheme="majorHAnsi" w:cstheme="majorBidi" w:ascii="Calibri" w:hAnsi="Calibri"/>
+      <w:rFonts w:asciiTheme="majorHAnsi" w:eastAsiaTheme="majorEastAsia" w:hAnsiTheme="majorHAnsi" w:cstheme="majorBidi"/>
       <w:b/>
       <w:bCs/>
-      <w:color w:val="0B2545"/>
-      <w:sz w:val="19"/>
+      <w:color w:val="4F81BD" w:themeColor="accent1"/>
+      <w:sz w:val="26"/>
       <w:szCs w:val="26"/>
     </w:rPr>
   </w:style>
@@ -12794,32 +12539,53 @@
       </w:tcPr>
     </w:tblStylePr>
   </w:style>
+  <w:style w:type="paragraph" w:customStyle="1" w:styleId="CVSection">
+    <w:name w:val="CV Section"/>
+    <w:basedOn w:val="Normal"/>
+    <w:pPr>
+      <w:keepNext/>
+      <w:spacing w:before="160" w:after="60"/>
+    </w:pPr>
+    <w:rPr>
+      <w:rFonts w:ascii="Aptos" w:hAnsi="Aptos"/>
+      <w:b/>
+      <w:color w:val="2E75B6"/>
+      <w:sz w:val="28"/>
+    </w:rPr>
+  </w:style>
+  <w:style w:type="paragraph" w:customStyle="1" w:styleId="CVRole">
+    <w:name w:val="CV Role"/>
+    <w:basedOn w:val="Normal"/>
+    <w:pPr>
+      <w:keepNext/>
+      <w:spacing w:before="80" w:after="20"/>
+    </w:pPr>
+    <w:rPr>
+      <w:rFonts w:ascii="Aptos" w:hAnsi="Aptos"/>
+      <w:sz w:val="22"/>
+    </w:rPr>
+  </w:style>
+  <w:style w:type="paragraph" w:customStyle="1" w:styleId="CVBody">
+    <w:name w:val="CV Body"/>
+    <w:basedOn w:val="Normal"/>
+    <w:pPr>
+      <w:spacing w:after="60" w:line="259" w:lineRule="auto"/>
+    </w:pPr>
+    <w:rPr>
+      <w:rFonts w:ascii="Aptos" w:hAnsi="Aptos"/>
+      <w:sz w:val="20"/>
+    </w:rPr>
+  </w:style>
   <w:style w:type="paragraph" w:customStyle="1" w:styleId="CVBullet">
     <w:name w:val="CV Bullet"/>
-    <w:basedOn w:val="Normal"/>
-    <w:pPr>
-      <w:keepLines/>
-      <w:spacing w:before="0" w:after="32" w:line="245" w:lineRule="auto"/>
+    <w:basedOn w:val="ListBullet"/>
+    <w:pPr>
+      <w:spacing w:after="40" w:line="252" w:lineRule="auto"/>
+      <w:ind w:left="317" w:hanging="230"/>
     </w:pPr>
     <w:rPr>
-      <w:rFonts w:ascii="Calibri" w:hAnsi="Calibri"/>
-      <w:b w:val="0"/>
-      <w:color w:val="20242A"/>
-      <w:sz w:val="18"/>
-    </w:rPr>
-  </w:style>
-  <w:style w:type="paragraph" w:customStyle="1" w:styleId="CVArea">
-    <w:name w:val="CV Area"/>
-    <w:basedOn w:val="Normal"/>
-    <w:pPr>
-      <w:keepLines/>
-      <w:spacing w:before="0" w:after="44" w:line="247" w:lineRule="auto"/>
-    </w:pPr>
-    <w:rPr>
-      <w:rFonts w:ascii="Calibri" w:hAnsi="Calibri"/>
-      <w:b w:val="0"/>
-      <w:color w:val="20242A"/>
-      <w:sz w:val="18"/>
+      <w:rFonts w:ascii="Aptos" w:hAnsi="Aptos"/>
+      <w:sz w:val="20"/>
     </w:rPr>
   </w:style>
 </w:styles>

</xml_diff>

<commit_message>
Cambios de documentos tras nuevos hitos en Herfrailes sl.
</commit_message>
<xml_diff>
--- a/boveda-entrevista-profesional/busqueda-empleo/presentacion-espontanea/cv-maestro.docx
+++ b/boveda-entrevista-profesional/busqueda-empleo/presentacion-espontanea/cv-maestro.docx
@@ -61,7 +61,7 @@
           <w:color w:val="202934"/>
           <w:sz w:val="20"/>
         </w:rPr>
-        <w:t>He dirigido de forma transversal personas, procesos, sistemas y operaciones; analizo procesos, modelo información y convierto tareas manuales en flujos documentados y automatizados. He aplicado este enfoque a la organización del trabajo, el aprovisionamiento, el control logístico, la gestión documental y los procesos administrativos.</w:t>
+        <w:t>He dirigido de forma transversal personas, procesos, sistemas y operaciones; analizo procesos, modelo información y convierto tareas manuales en flujos documentados y automatizados. He aplicado este enfoque a la organización del trabajo, el aprovisionamiento, la optimización de stock, el control logístico, la gestión documental y los procesos administrativos.</w:t>
       </w:r>
     </w:p>
     <w:p>
@@ -101,7 +101,7 @@
           <w:color w:val="202934"/>
           <w:sz w:val="20"/>
         </w:rPr>
-        <w:t>Sistemas y datos. He diseñado bases de datos, algoritmos de pedido y análisis de datos de clientes, ajustando los modelos cuando detectaba desviaciones.</w:t>
+        <w:t>Sistemas y datos. He diseñado bases de datos, algoritmos de pedido y sistemas de redistribución de stock entre tiendas, ajustando los modelos cuando detectaba desviaciones.</w:t>
       </w:r>
     </w:p>
     <w:p>
@@ -167,7 +167,21 @@
           <w:color w:val="202934"/>
           <w:sz w:val="20"/>
         </w:rPr>
-        <w:t>He asumido responsabilidades simultáneas en personas, IT, operaciones, logística y parte de administración, conectando necesidades de negocio, información y ejecución.</w:t>
+        <w:t xml:space="preserve">En Herfrailes S. L., empresa socia de CENCOSU S. L., titular de los derechos de explotación de la franquicia internacional SPAR en Gran Canaria, he asumido responsabilidades simultáneas en </w:t>
+      </w:r>
+      <w:r>
+        <w:rPr>
+          <w:color w:val="202934"/>
+          <w:sz w:val="20"/>
+        </w:rPr>
+        <w:t>RRHH</w:t>
+      </w:r>
+      <w:r>
+        <w:rPr>
+          <w:color w:val="202934"/>
+          <w:sz w:val="20"/>
+        </w:rPr>
+        <w:t>, IT, operaciones, logística y parte de administración.</w:t>
       </w:r>
     </w:p>
     <w:p>
@@ -221,7 +235,7 @@
           <w:color w:val="202934"/>
           <w:sz w:val="20"/>
         </w:rPr>
-        <w:t>He creado un sistema de seguimiento del mantenimiento de los vehículos de la empresa.</w:t>
+        <w:t>He programado un sistema de redistribución de stock entre tres tiendas, con dos ciclos diarios y vehículos propios; reduje el stock inmovilizado, acorté el retorno de la inversión en compras y aumenté la rotación mensual.</w:t>
       </w:r>
     </w:p>
     <w:p>
@@ -239,7 +253,7 @@
           <w:color w:val="202934"/>
           <w:sz w:val="20"/>
         </w:rPr>
-        <w:t>He diseñado y coordinado dos campañas de recogida de datos de procedencia de clientes para delimitar la zona de influencia de las tiendas; el análisis identificó que el 42 % de la clientela de la tienda grande procedía de la zona en riesgo ante una nueva competencia.</w:t>
+        <w:t>He implantado Trello para asignar y revisar la mayoría de las tareas operativas de tiendas y secciones, con un listado diario de hasta 200 tareas pendientes de revisión; durante los tres últimos años automaticé parcialmente el seguimiento y la respuesta con VB.NET y la API de Trello.</w:t>
       </w:r>
     </w:p>
     <w:p>
@@ -303,6 +317,30 @@
           <w:sz w:val="28"/>
         </w:rPr>
         <w:t>Experiencia profesional seleccionada - continuación</w:t>
+      </w:r>
+    </w:p>
+    <w:p>
+      <w:pPr>
+        <w:pStyle w:val="CVRole"/>
+        <w:rPr/>
+      </w:pPr>
+      <w:r>
+        <w:rPr>
+          <w:b/>
+          <w:color w:val="17365D"/>
+          <w:sz w:val="22"/>
+        </w:rPr>
+        <w:t>Actualización profesional y formación en IA  ·  2024 - actualidad</w:t>
+      </w:r>
+    </w:p>
+    <w:p>
+      <w:pPr>
+        <w:pStyle w:val="Normal"/>
+        <w:rPr/>
+      </w:pPr>
+      <w:r>
+        <w:rPr/>
+        <w:t>Tras el cierre de mi etapa en Herfrailes, he dedicado este periodo a mi actualización profesional en inteligencia artificial mediante cursos y un máster en curso.</w:t>
       </w:r>
     </w:p>
     <w:p>
@@ -443,7 +481,7 @@
           <w:color w:val="202934"/>
           <w:sz w:val="20"/>
         </w:rPr>
-        <w:t>Dirección transversal de operaciones; análisis de procesos y requisitos; modelado de datos y documentación; automatización administrativa y operativa; diseño de algoritmos de previsión y control; trazabilidad documental y protección de datos.</w:t>
+        <w:t>Dirección transversal de operaciones; análisis de procesos y requisitos; modelado de datos y documentación; automatización administrativa y operativa; optimización de stock, logística con vehículos propios y diseño de algoritmos de previsión y control; trazabilidad documental y protección de datos.</w:t>
       </w:r>
     </w:p>
     <w:p>
@@ -802,6 +840,7 @@
         </w:tabs>
         <w:ind w:start="1080" w:hanging="360"/>
       </w:pPr>
+      <w:rPr/>
     </w:lvl>
     <w:lvl w:ilvl="2">
       <w:start w:val="1"/>
@@ -814,6 +853,7 @@
         </w:tabs>
         <w:ind w:start="1440" w:hanging="360"/>
       </w:pPr>
+      <w:rPr/>
     </w:lvl>
     <w:lvl w:ilvl="3">
       <w:start w:val="1"/>
@@ -826,6 +866,7 @@
         </w:tabs>
         <w:ind w:start="1800" w:hanging="360"/>
       </w:pPr>
+      <w:rPr/>
     </w:lvl>
     <w:lvl w:ilvl="4">
       <w:start w:val="1"/>
@@ -838,6 +879,7 @@
         </w:tabs>
         <w:ind w:start="2160" w:hanging="360"/>
       </w:pPr>
+      <w:rPr/>
     </w:lvl>
     <w:lvl w:ilvl="5">
       <w:start w:val="1"/>
@@ -850,6 +892,7 @@
         </w:tabs>
         <w:ind w:start="2520" w:hanging="360"/>
       </w:pPr>
+      <w:rPr/>
     </w:lvl>
     <w:lvl w:ilvl="6">
       <w:start w:val="1"/>
@@ -862,6 +905,7 @@
         </w:tabs>
         <w:ind w:start="2880" w:hanging="360"/>
       </w:pPr>
+      <w:rPr/>
     </w:lvl>
     <w:lvl w:ilvl="7">
       <w:start w:val="1"/>
@@ -874,6 +918,7 @@
         </w:tabs>
         <w:ind w:start="3240" w:hanging="360"/>
       </w:pPr>
+      <w:rPr/>
     </w:lvl>
     <w:lvl w:ilvl="8">
       <w:start w:val="1"/>
@@ -886,6 +931,7 @@
         </w:tabs>
         <w:ind w:start="3600" w:hanging="360"/>
       </w:pPr>
+      <w:rPr/>
     </w:lvl>
   </w:abstractNum>
   <w:abstractNum w:abstractNumId="2">
@@ -915,6 +961,7 @@
         </w:tabs>
         <w:ind w:start="1080" w:hanging="360"/>
       </w:pPr>
+      <w:rPr/>
     </w:lvl>
     <w:lvl w:ilvl="2">
       <w:start w:val="1"/>
@@ -927,6 +974,7 @@
         </w:tabs>
         <w:ind w:start="1440" w:hanging="360"/>
       </w:pPr>
+      <w:rPr/>
     </w:lvl>
     <w:lvl w:ilvl="3">
       <w:start w:val="1"/>
@@ -939,6 +987,7 @@
         </w:tabs>
         <w:ind w:start="1800" w:hanging="360"/>
       </w:pPr>
+      <w:rPr/>
     </w:lvl>
     <w:lvl w:ilvl="4">
       <w:start w:val="1"/>
@@ -951,6 +1000,7 @@
         </w:tabs>
         <w:ind w:start="2160" w:hanging="360"/>
       </w:pPr>
+      <w:rPr/>
     </w:lvl>
     <w:lvl w:ilvl="5">
       <w:start w:val="1"/>
@@ -963,6 +1013,7 @@
         </w:tabs>
         <w:ind w:start="2520" w:hanging="360"/>
       </w:pPr>
+      <w:rPr/>
     </w:lvl>
     <w:lvl w:ilvl="6">
       <w:start w:val="1"/>
@@ -975,6 +1026,7 @@
         </w:tabs>
         <w:ind w:start="2880" w:hanging="360"/>
       </w:pPr>
+      <w:rPr/>
     </w:lvl>
     <w:lvl w:ilvl="7">
       <w:start w:val="1"/>
@@ -987,6 +1039,7 @@
         </w:tabs>
         <w:ind w:start="3240" w:hanging="360"/>
       </w:pPr>
+      <w:rPr/>
     </w:lvl>
     <w:lvl w:ilvl="8">
       <w:start w:val="1"/>
@@ -999,6 +1052,7 @@
         </w:tabs>
         <w:ind w:start="3600" w:hanging="360"/>
       </w:pPr>
+      <w:rPr/>
     </w:lvl>
   </w:abstractNum>
   <w:abstractNum w:abstractNumId="3">
@@ -1028,6 +1082,7 @@
         </w:tabs>
         <w:ind w:start="1080" w:hanging="360"/>
       </w:pPr>
+      <w:rPr/>
     </w:lvl>
     <w:lvl w:ilvl="2">
       <w:start w:val="1"/>
@@ -1040,6 +1095,7 @@
         </w:tabs>
         <w:ind w:start="1440" w:hanging="360"/>
       </w:pPr>
+      <w:rPr/>
     </w:lvl>
     <w:lvl w:ilvl="3">
       <w:start w:val="1"/>
@@ -1052,6 +1108,7 @@
         </w:tabs>
         <w:ind w:start="1800" w:hanging="360"/>
       </w:pPr>
+      <w:rPr/>
     </w:lvl>
     <w:lvl w:ilvl="4">
       <w:start w:val="1"/>
@@ -1064,6 +1121,7 @@
         </w:tabs>
         <w:ind w:start="2160" w:hanging="360"/>
       </w:pPr>
+      <w:rPr/>
     </w:lvl>
     <w:lvl w:ilvl="5">
       <w:start w:val="1"/>
@@ -1076,6 +1134,7 @@
         </w:tabs>
         <w:ind w:start="2520" w:hanging="360"/>
       </w:pPr>
+      <w:rPr/>
     </w:lvl>
     <w:lvl w:ilvl="6">
       <w:start w:val="1"/>
@@ -1088,6 +1147,7 @@
         </w:tabs>
         <w:ind w:start="2880" w:hanging="360"/>
       </w:pPr>
+      <w:rPr/>
     </w:lvl>
     <w:lvl w:ilvl="7">
       <w:start w:val="1"/>
@@ -1100,6 +1160,7 @@
         </w:tabs>
         <w:ind w:start="3240" w:hanging="360"/>
       </w:pPr>
+      <w:rPr/>
     </w:lvl>
     <w:lvl w:ilvl="8">
       <w:start w:val="1"/>
@@ -1112,6 +1173,7 @@
         </w:tabs>
         <w:ind w:start="3600" w:hanging="360"/>
       </w:pPr>
+      <w:rPr/>
     </w:lvl>
   </w:abstractNum>
   <w:abstractNum w:abstractNumId="4">
@@ -1139,6 +1201,7 @@
         </w:tabs>
         <w:ind w:start="1080" w:hanging="360"/>
       </w:pPr>
+      <w:rPr/>
     </w:lvl>
     <w:lvl w:ilvl="2">
       <w:start w:val="1"/>
@@ -1151,6 +1214,7 @@
         </w:tabs>
         <w:ind w:start="1440" w:hanging="360"/>
       </w:pPr>
+      <w:rPr/>
     </w:lvl>
     <w:lvl w:ilvl="3">
       <w:start w:val="1"/>
@@ -1163,6 +1227,7 @@
         </w:tabs>
         <w:ind w:start="1800" w:hanging="360"/>
       </w:pPr>
+      <w:rPr/>
     </w:lvl>
     <w:lvl w:ilvl="4">
       <w:start w:val="1"/>
@@ -1175,6 +1240,7 @@
         </w:tabs>
         <w:ind w:start="2160" w:hanging="360"/>
       </w:pPr>
+      <w:rPr/>
     </w:lvl>
     <w:lvl w:ilvl="5">
       <w:start w:val="1"/>
@@ -1187,6 +1253,7 @@
         </w:tabs>
         <w:ind w:start="2520" w:hanging="360"/>
       </w:pPr>
+      <w:rPr/>
     </w:lvl>
     <w:lvl w:ilvl="6">
       <w:start w:val="1"/>
@@ -1199,6 +1266,7 @@
         </w:tabs>
         <w:ind w:start="2880" w:hanging="360"/>
       </w:pPr>
+      <w:rPr/>
     </w:lvl>
     <w:lvl w:ilvl="7">
       <w:start w:val="1"/>
@@ -1211,6 +1279,7 @@
         </w:tabs>
         <w:ind w:start="3240" w:hanging="360"/>
       </w:pPr>
+      <w:rPr/>
     </w:lvl>
     <w:lvl w:ilvl="8">
       <w:start w:val="1"/>
@@ -1223,6 +1292,7 @@
         </w:tabs>
         <w:ind w:start="3600" w:hanging="360"/>
       </w:pPr>
+      <w:rPr/>
     </w:lvl>
   </w:abstractNum>
   <w:abstractNum w:abstractNumId="5">
@@ -1250,6 +1320,7 @@
         </w:tabs>
         <w:ind w:start="1080" w:hanging="360"/>
       </w:pPr>
+      <w:rPr/>
     </w:lvl>
     <w:lvl w:ilvl="2">
       <w:start w:val="1"/>
@@ -1262,6 +1333,7 @@
         </w:tabs>
         <w:ind w:start="1440" w:hanging="360"/>
       </w:pPr>
+      <w:rPr/>
     </w:lvl>
     <w:lvl w:ilvl="3">
       <w:start w:val="1"/>
@@ -1274,6 +1346,7 @@
         </w:tabs>
         <w:ind w:start="1800" w:hanging="360"/>
       </w:pPr>
+      <w:rPr/>
     </w:lvl>
     <w:lvl w:ilvl="4">
       <w:start w:val="1"/>
@@ -1286,6 +1359,7 @@
         </w:tabs>
         <w:ind w:start="2160" w:hanging="360"/>
       </w:pPr>
+      <w:rPr/>
     </w:lvl>
     <w:lvl w:ilvl="5">
       <w:start w:val="1"/>
@@ -1298,6 +1372,7 @@
         </w:tabs>
         <w:ind w:start="2520" w:hanging="360"/>
       </w:pPr>
+      <w:rPr/>
     </w:lvl>
     <w:lvl w:ilvl="6">
       <w:start w:val="1"/>
@@ -1310,6 +1385,7 @@
         </w:tabs>
         <w:ind w:start="2880" w:hanging="360"/>
       </w:pPr>
+      <w:rPr/>
     </w:lvl>
     <w:lvl w:ilvl="7">
       <w:start w:val="1"/>
@@ -1322,6 +1398,7 @@
         </w:tabs>
         <w:ind w:start="3240" w:hanging="360"/>
       </w:pPr>
+      <w:rPr/>
     </w:lvl>
     <w:lvl w:ilvl="8">
       <w:start w:val="1"/>
@@ -1334,6 +1411,7 @@
         </w:tabs>
         <w:ind w:start="3600" w:hanging="360"/>
       </w:pPr>
+      <w:rPr/>
     </w:lvl>
   </w:abstractNum>
   <w:abstractNum w:abstractNumId="6">
@@ -1361,6 +1439,7 @@
         </w:tabs>
         <w:ind w:start="1080" w:hanging="360"/>
       </w:pPr>
+      <w:rPr/>
     </w:lvl>
     <w:lvl w:ilvl="2">
       <w:start w:val="1"/>
@@ -1373,6 +1452,7 @@
         </w:tabs>
         <w:ind w:start="1440" w:hanging="360"/>
       </w:pPr>
+      <w:rPr/>
     </w:lvl>
     <w:lvl w:ilvl="3">
       <w:start w:val="1"/>
@@ -1385,6 +1465,7 @@
         </w:tabs>
         <w:ind w:start="1800" w:hanging="360"/>
       </w:pPr>
+      <w:rPr/>
     </w:lvl>
     <w:lvl w:ilvl="4">
       <w:start w:val="1"/>
@@ -1397,6 +1478,7 @@
         </w:tabs>
         <w:ind w:start="2160" w:hanging="360"/>
       </w:pPr>
+      <w:rPr/>
     </w:lvl>
     <w:lvl w:ilvl="5">
       <w:start w:val="1"/>
@@ -1409,6 +1491,7 @@
         </w:tabs>
         <w:ind w:start="2520" w:hanging="360"/>
       </w:pPr>
+      <w:rPr/>
     </w:lvl>
     <w:lvl w:ilvl="6">
       <w:start w:val="1"/>
@@ -1421,6 +1504,7 @@
         </w:tabs>
         <w:ind w:start="2880" w:hanging="360"/>
       </w:pPr>
+      <w:rPr/>
     </w:lvl>
     <w:lvl w:ilvl="7">
       <w:start w:val="1"/>
@@ -1433,6 +1517,7 @@
         </w:tabs>
         <w:ind w:start="3240" w:hanging="360"/>
       </w:pPr>
+      <w:rPr/>
     </w:lvl>
     <w:lvl w:ilvl="8">
       <w:start w:val="1"/>
@@ -1445,6 +1530,7 @@
         </w:tabs>
         <w:ind w:start="3600" w:hanging="360"/>
       </w:pPr>
+      <w:rPr/>
     </w:lvl>
   </w:abstractNum>
   <w:abstractNum w:abstractNumId="7">
@@ -1595,7 +1681,7 @@
   <w:docDefaults>
     <w:rPrDefault>
       <w:rPr>
-        <w:rFonts w:ascii="Cambria" w:hAnsi="Cambria" w:eastAsia="ＭＳ 明朝" w:cs="" w:asciiTheme="minorHAnsi" w:cstheme="minorBidi" w:eastAsiaTheme="minorEastAsia" w:hAnsiTheme="minorHAnsi"/>
+        <w:rFonts w:ascii="Cambria" w:hAnsi="Cambria" w:eastAsia="" w:cs="" w:asciiTheme="minorHAnsi" w:cstheme="minorBidi" w:eastAsiaTheme="minorEastAsia" w:hAnsiTheme="minorHAnsi"/>
         <w:sz w:val="22"/>
         <w:szCs w:val="22"/>
         <w:lang w:val="en-US" w:eastAsia="en-US" w:bidi="ar-SA"/>
@@ -1752,6 +1838,7 @@
     <w:rsid w:val="00fc693f"/>
     <w:pPr>
       <w:widowControl/>
+      <w:suppressAutoHyphens w:val="true"/>
       <w:bidi w:val="0"/>
       <w:spacing w:lineRule="auto" w:line="259" w:before="0" w:after="80"/>
       <w:jc w:val="both"/>
@@ -1780,7 +1867,7 @@
       <w:outlineLvl w:val="0"/>
     </w:pPr>
     <w:rPr>
-      <w:rFonts w:ascii="Calibri" w:hAnsi="Calibri" w:eastAsia="ＭＳ ゴシック" w:cs="" w:asciiTheme="majorHAnsi" w:cstheme="majorBidi" w:eastAsiaTheme="majorEastAsia" w:hAnsiTheme="majorHAnsi"/>
+      <w:rFonts w:ascii="Calibri" w:hAnsi="Calibri" w:eastAsia="" w:cs="" w:asciiTheme="majorHAnsi" w:cstheme="majorBidi" w:eastAsiaTheme="majorEastAsia" w:hAnsiTheme="majorHAnsi"/>
       <w:b/>
       <w:bCs/>
       <w:color w:themeColor="accent1" w:themeShade="bf" w:val="365F91"/>
@@ -1804,7 +1891,7 @@
       <w:outlineLvl w:val="1"/>
     </w:pPr>
     <w:rPr>
-      <w:rFonts w:ascii="Calibri" w:hAnsi="Calibri" w:eastAsia="ＭＳ ゴシック" w:cs="" w:asciiTheme="majorHAnsi" w:cstheme="majorBidi" w:eastAsiaTheme="majorEastAsia" w:hAnsiTheme="majorHAnsi"/>
+      <w:rFonts w:ascii="Calibri" w:hAnsi="Calibri" w:eastAsia="" w:cs="" w:asciiTheme="majorHAnsi" w:cstheme="majorBidi" w:eastAsiaTheme="majorEastAsia" w:hAnsiTheme="majorHAnsi"/>
       <w:b/>
       <w:bCs/>
       <w:color w:themeColor="accent1" w:val="4F81BD"/>
@@ -1828,7 +1915,7 @@
       <w:outlineLvl w:val="2"/>
     </w:pPr>
     <w:rPr>
-      <w:rFonts w:ascii="Calibri" w:hAnsi="Calibri" w:eastAsia="ＭＳ ゴシック" w:cs="" w:asciiTheme="majorHAnsi" w:cstheme="majorBidi" w:eastAsiaTheme="majorEastAsia" w:hAnsiTheme="majorHAnsi"/>
+      <w:rFonts w:ascii="Calibri" w:hAnsi="Calibri" w:eastAsia="" w:cs="" w:asciiTheme="majorHAnsi" w:cstheme="majorBidi" w:eastAsiaTheme="majorEastAsia" w:hAnsiTheme="majorHAnsi"/>
       <w:b/>
       <w:bCs/>
       <w:color w:themeColor="accent1" w:val="4F81BD"/>
@@ -1851,7 +1938,7 @@
       <w:outlineLvl w:val="3"/>
     </w:pPr>
     <w:rPr>
-      <w:rFonts w:ascii="Calibri" w:hAnsi="Calibri" w:eastAsia="ＭＳ ゴシック" w:cs="" w:asciiTheme="majorHAnsi" w:cstheme="majorBidi" w:eastAsiaTheme="majorEastAsia" w:hAnsiTheme="majorHAnsi"/>
+      <w:rFonts w:ascii="Calibri" w:hAnsi="Calibri" w:eastAsia="" w:cs="" w:asciiTheme="majorHAnsi" w:cstheme="majorBidi" w:eastAsiaTheme="majorEastAsia" w:hAnsiTheme="majorHAnsi"/>
       <w:b/>
       <w:bCs/>
       <w:i/>
@@ -1876,7 +1963,7 @@
       <w:outlineLvl w:val="4"/>
     </w:pPr>
     <w:rPr>
-      <w:rFonts w:ascii="Calibri" w:hAnsi="Calibri" w:eastAsia="ＭＳ ゴシック" w:cs="" w:asciiTheme="majorHAnsi" w:cstheme="majorBidi" w:eastAsiaTheme="majorEastAsia" w:hAnsiTheme="majorHAnsi"/>
+      <w:rFonts w:ascii="Calibri" w:hAnsi="Calibri" w:eastAsia="" w:cs="" w:asciiTheme="majorHAnsi" w:cstheme="majorBidi" w:eastAsiaTheme="majorEastAsia" w:hAnsiTheme="majorHAnsi"/>
       <w:color w:themeColor="accent1" w:themeShade="7f" w:val="243F60"/>
     </w:rPr>
   </w:style>
@@ -1897,7 +1984,7 @@
       <w:outlineLvl w:val="5"/>
     </w:pPr>
     <w:rPr>
-      <w:rFonts w:ascii="Calibri" w:hAnsi="Calibri" w:eastAsia="ＭＳ ゴシック" w:cs="" w:asciiTheme="majorHAnsi" w:cstheme="majorBidi" w:eastAsiaTheme="majorEastAsia" w:hAnsiTheme="majorHAnsi"/>
+      <w:rFonts w:ascii="Calibri" w:hAnsi="Calibri" w:eastAsia="" w:cs="" w:asciiTheme="majorHAnsi" w:cstheme="majorBidi" w:eastAsiaTheme="majorEastAsia" w:hAnsiTheme="majorHAnsi"/>
       <w:i/>
       <w:iCs/>
       <w:color w:themeColor="accent1" w:themeShade="7f" w:val="243F60"/>
@@ -1920,7 +2007,7 @@
       <w:outlineLvl w:val="6"/>
     </w:pPr>
     <w:rPr>
-      <w:rFonts w:ascii="Calibri" w:hAnsi="Calibri" w:eastAsia="ＭＳ ゴシック" w:cs="" w:asciiTheme="majorHAnsi" w:cstheme="majorBidi" w:eastAsiaTheme="majorEastAsia" w:hAnsiTheme="majorHAnsi"/>
+      <w:rFonts w:ascii="Calibri" w:hAnsi="Calibri" w:eastAsia="" w:cs="" w:asciiTheme="majorHAnsi" w:cstheme="majorBidi" w:eastAsiaTheme="majorEastAsia" w:hAnsiTheme="majorHAnsi"/>
       <w:i/>
       <w:iCs/>
       <w:color w:themeColor="text1" w:themeTint="bf" w:val="404040"/>
@@ -1943,7 +2030,7 @@
       <w:outlineLvl w:val="7"/>
     </w:pPr>
     <w:rPr>
-      <w:rFonts w:ascii="Calibri" w:hAnsi="Calibri" w:eastAsia="ＭＳ ゴシック" w:cs="" w:asciiTheme="majorHAnsi" w:cstheme="majorBidi" w:eastAsiaTheme="majorEastAsia" w:hAnsiTheme="majorHAnsi"/>
+      <w:rFonts w:ascii="Calibri" w:hAnsi="Calibri" w:eastAsia="" w:cs="" w:asciiTheme="majorHAnsi" w:cstheme="majorBidi" w:eastAsiaTheme="majorEastAsia" w:hAnsiTheme="majorHAnsi"/>
       <w:color w:themeColor="accent1" w:val="4F81BD"/>
       <w:sz w:val="20"/>
       <w:szCs w:val="20"/>
@@ -1966,7 +2053,7 @@
       <w:outlineLvl w:val="8"/>
     </w:pPr>
     <w:rPr>
-      <w:rFonts w:ascii="Calibri" w:hAnsi="Calibri" w:eastAsia="ＭＳ ゴシック" w:cs="" w:asciiTheme="majorHAnsi" w:cstheme="majorBidi" w:eastAsiaTheme="majorEastAsia" w:hAnsiTheme="majorHAnsi"/>
+      <w:rFonts w:ascii="Calibri" w:hAnsi="Calibri" w:eastAsia="" w:cs="" w:asciiTheme="majorHAnsi" w:cstheme="majorBidi" w:eastAsiaTheme="majorEastAsia" w:hAnsiTheme="majorHAnsi"/>
       <w:i/>
       <w:iCs/>
       <w:color w:themeColor="text1" w:themeTint="bf" w:val="404040"/>
@@ -2005,7 +2092,7 @@
     <w:qFormat/>
     <w:rsid w:val="00fc693f"/>
     <w:rPr>
-      <w:rFonts w:ascii="Calibri" w:hAnsi="Calibri" w:eastAsia="ＭＳ ゴシック" w:cs="" w:asciiTheme="majorHAnsi" w:cstheme="majorBidi" w:eastAsiaTheme="majorEastAsia" w:hAnsiTheme="majorHAnsi"/>
+      <w:rFonts w:ascii="Calibri" w:hAnsi="Calibri" w:eastAsia="" w:cs="" w:asciiTheme="majorHAnsi" w:cstheme="majorBidi" w:eastAsiaTheme="majorEastAsia" w:hAnsiTheme="majorHAnsi"/>
       <w:b/>
       <w:bCs/>
       <w:color w:themeColor="accent1" w:themeShade="bf" w:val="365F91"/>
@@ -2020,7 +2107,7 @@
     <w:qFormat/>
     <w:rsid w:val="00fc693f"/>
     <w:rPr>
-      <w:rFonts w:ascii="Calibri" w:hAnsi="Calibri" w:eastAsia="ＭＳ ゴシック" w:cs="" w:asciiTheme="majorHAnsi" w:cstheme="majorBidi" w:eastAsiaTheme="majorEastAsia" w:hAnsiTheme="majorHAnsi"/>
+      <w:rFonts w:ascii="Calibri" w:hAnsi="Calibri" w:eastAsia="" w:cs="" w:asciiTheme="majorHAnsi" w:cstheme="majorBidi" w:eastAsiaTheme="majorEastAsia" w:hAnsiTheme="majorHAnsi"/>
       <w:b/>
       <w:bCs/>
       <w:color w:themeColor="accent1" w:val="4F81BD"/>
@@ -2035,7 +2122,7 @@
     <w:qFormat/>
     <w:rsid w:val="00fc693f"/>
     <w:rPr>
-      <w:rFonts w:ascii="Calibri" w:hAnsi="Calibri" w:eastAsia="ＭＳ ゴシック" w:cs="" w:asciiTheme="majorHAnsi" w:cstheme="majorBidi" w:eastAsiaTheme="majorEastAsia" w:hAnsiTheme="majorHAnsi"/>
+      <w:rFonts w:ascii="Calibri" w:hAnsi="Calibri" w:eastAsia="" w:cs="" w:asciiTheme="majorHAnsi" w:cstheme="majorBidi" w:eastAsiaTheme="majorEastAsia" w:hAnsiTheme="majorHAnsi"/>
       <w:b/>
       <w:bCs/>
       <w:color w:themeColor="accent1" w:val="4F81BD"/>
@@ -2048,7 +2135,7 @@
     <w:qFormat/>
     <w:rsid w:val="00fc693f"/>
     <w:rPr>
-      <w:rFonts w:ascii="Calibri" w:hAnsi="Calibri" w:eastAsia="ＭＳ ゴシック" w:cs="" w:asciiTheme="majorHAnsi" w:cstheme="majorBidi" w:eastAsiaTheme="majorEastAsia" w:hAnsiTheme="majorHAnsi"/>
+      <w:rFonts w:ascii="Calibri" w:hAnsi="Calibri" w:eastAsia="" w:cs="" w:asciiTheme="majorHAnsi" w:cstheme="majorBidi" w:eastAsiaTheme="majorEastAsia" w:hAnsiTheme="majorHAnsi"/>
       <w:color w:themeColor="text2" w:themeShade="bf" w:val="17365D"/>
       <w:spacing w:val="5"/>
       <w:kern w:val="2"/>
@@ -2063,7 +2150,7 @@
     <w:qFormat/>
     <w:rsid w:val="00fc693f"/>
     <w:rPr>
-      <w:rFonts w:ascii="Calibri" w:hAnsi="Calibri" w:eastAsia="ＭＳ ゴシック" w:cs="" w:asciiTheme="majorHAnsi" w:cstheme="majorBidi" w:eastAsiaTheme="majorEastAsia" w:hAnsiTheme="majorHAnsi"/>
+      <w:rFonts w:ascii="Calibri" w:hAnsi="Calibri" w:eastAsia="" w:cs="" w:asciiTheme="majorHAnsi" w:cstheme="majorBidi" w:eastAsiaTheme="majorEastAsia" w:hAnsiTheme="majorHAnsi"/>
       <w:i/>
       <w:iCs/>
       <w:color w:themeColor="accent1" w:val="4F81BD"/>
@@ -2135,7 +2222,7 @@
     <w:qFormat/>
     <w:rsid w:val="00fc693f"/>
     <w:rPr>
-      <w:rFonts w:ascii="Calibri" w:hAnsi="Calibri" w:eastAsia="ＭＳ ゴシック" w:cs="" w:asciiTheme="majorHAnsi" w:cstheme="majorBidi" w:eastAsiaTheme="majorEastAsia" w:hAnsiTheme="majorHAnsi"/>
+      <w:rFonts w:ascii="Calibri" w:hAnsi="Calibri" w:eastAsia="" w:cs="" w:asciiTheme="majorHAnsi" w:cstheme="majorBidi" w:eastAsiaTheme="majorEastAsia" w:hAnsiTheme="majorHAnsi"/>
       <w:b/>
       <w:bCs/>
       <w:i/>
@@ -2151,7 +2238,7 @@
     <w:qFormat/>
     <w:rsid w:val="00fc693f"/>
     <w:rPr>
-      <w:rFonts w:ascii="Calibri" w:hAnsi="Calibri" w:eastAsia="ＭＳ ゴシック" w:cs="" w:asciiTheme="majorHAnsi" w:cstheme="majorBidi" w:eastAsiaTheme="majorEastAsia" w:hAnsiTheme="majorHAnsi"/>
+      <w:rFonts w:ascii="Calibri" w:hAnsi="Calibri" w:eastAsia="" w:cs="" w:asciiTheme="majorHAnsi" w:cstheme="majorBidi" w:eastAsiaTheme="majorEastAsia" w:hAnsiTheme="majorHAnsi"/>
       <w:color w:themeColor="accent1" w:themeShade="7f" w:val="243F60"/>
     </w:rPr>
   </w:style>
@@ -2163,7 +2250,7 @@
     <w:qFormat/>
     <w:rsid w:val="00fc693f"/>
     <w:rPr>
-      <w:rFonts w:ascii="Calibri" w:hAnsi="Calibri" w:eastAsia="ＭＳ ゴシック" w:cs="" w:asciiTheme="majorHAnsi" w:cstheme="majorBidi" w:eastAsiaTheme="majorEastAsia" w:hAnsiTheme="majorHAnsi"/>
+      <w:rFonts w:ascii="Calibri" w:hAnsi="Calibri" w:eastAsia="" w:cs="" w:asciiTheme="majorHAnsi" w:cstheme="majorBidi" w:eastAsiaTheme="majorEastAsia" w:hAnsiTheme="majorHAnsi"/>
       <w:i/>
       <w:iCs/>
       <w:color w:themeColor="accent1" w:themeShade="7f" w:val="243F60"/>
@@ -2177,7 +2264,7 @@
     <w:qFormat/>
     <w:rsid w:val="00fc693f"/>
     <w:rPr>
-      <w:rFonts w:ascii="Calibri" w:hAnsi="Calibri" w:eastAsia="ＭＳ ゴシック" w:cs="" w:asciiTheme="majorHAnsi" w:cstheme="majorBidi" w:eastAsiaTheme="majorEastAsia" w:hAnsiTheme="majorHAnsi"/>
+      <w:rFonts w:ascii="Calibri" w:hAnsi="Calibri" w:eastAsia="" w:cs="" w:asciiTheme="majorHAnsi" w:cstheme="majorBidi" w:eastAsiaTheme="majorEastAsia" w:hAnsiTheme="majorHAnsi"/>
       <w:i/>
       <w:iCs/>
       <w:color w:themeColor="text1" w:themeTint="bf" w:val="404040"/>
@@ -2191,7 +2278,7 @@
     <w:qFormat/>
     <w:rsid w:val="00fc693f"/>
     <w:rPr>
-      <w:rFonts w:ascii="Calibri" w:hAnsi="Calibri" w:eastAsia="ＭＳ ゴシック" w:cs="" w:asciiTheme="majorHAnsi" w:cstheme="majorBidi" w:eastAsiaTheme="majorEastAsia" w:hAnsiTheme="majorHAnsi"/>
+      <w:rFonts w:ascii="Calibri" w:hAnsi="Calibri" w:eastAsia="" w:cs="" w:asciiTheme="majorHAnsi" w:cstheme="majorBidi" w:eastAsiaTheme="majorEastAsia" w:hAnsiTheme="majorHAnsi"/>
       <w:color w:themeColor="accent1" w:val="4F81BD"/>
       <w:sz w:val="20"/>
       <w:szCs w:val="20"/>
@@ -2205,7 +2292,7 @@
     <w:qFormat/>
     <w:rsid w:val="00fc693f"/>
     <w:rPr>
-      <w:rFonts w:ascii="Calibri" w:hAnsi="Calibri" w:eastAsia="ＭＳ ゴシック" w:cs="" w:asciiTheme="majorHAnsi" w:cstheme="majorBidi" w:eastAsiaTheme="majorEastAsia" w:hAnsiTheme="majorHAnsi"/>
+      <w:rFonts w:ascii="Calibri" w:hAnsi="Calibri" w:eastAsia="" w:cs="" w:asciiTheme="majorHAnsi" w:cstheme="majorBidi" w:eastAsiaTheme="majorEastAsia" w:hAnsiTheme="majorHAnsi"/>
       <w:i/>
       <w:iCs/>
       <w:color w:themeColor="text1" w:themeTint="bf" w:val="404040"/>
@@ -2387,6 +2474,39 @@
       <w:rFonts w:cs="Lucida Sans"/>
     </w:rPr>
   </w:style>
+  <w:style w:type="paragraph" w:styleId="Ttulouser">
+    <w:name w:val="Título (user)"/>
+    <w:basedOn w:val="Normal"/>
+    <w:next w:val="BodyText"/>
+    <w:qFormat/>
+    <w:pPr>
+      <w:keepNext w:val="true"/>
+      <w:spacing w:before="240" w:after="120"/>
+    </w:pPr>
+    <w:rPr>
+      <w:rFonts w:ascii="Liberation Sans" w:hAnsi="Liberation Sans" w:eastAsia="Microsoft YaHei" w:cs="Lucida Sans"/>
+      <w:sz w:val="28"/>
+      <w:szCs w:val="28"/>
+    </w:rPr>
+  </w:style>
+  <w:style w:type="paragraph" w:styleId="ndiceuser">
+    <w:name w:val="Índice (user)"/>
+    <w:basedOn w:val="Normal"/>
+    <w:qFormat/>
+    <w:pPr>
+      <w:suppressLineNumbers/>
+    </w:pPr>
+    <w:rPr>
+      <w:rFonts w:cs="Lucida Sans"/>
+    </w:rPr>
+  </w:style>
+  <w:style w:type="paragraph" w:styleId="Cabeceraypieuser">
+    <w:name w:val="Cabecera y pie (user)"/>
+    <w:basedOn w:val="Normal"/>
+    <w:qFormat/>
+    <w:pPr/>
+    <w:rPr/>
+  </w:style>
   <w:style w:type="paragraph" w:styleId="Cabeceraypie">
     <w:name w:val="Cabecera y pie"/>
     <w:basedOn w:val="Normal"/>
@@ -2435,12 +2555,13 @@
     <w:rsid w:val="00fc693f"/>
     <w:pPr>
       <w:widowControl/>
+      <w:suppressAutoHyphens w:val="true"/>
       <w:bidi w:val="0"/>
       <w:spacing w:lineRule="auto" w:line="240" w:before="0" w:after="0"/>
       <w:jc w:val="start"/>
     </w:pPr>
     <w:rPr>
-      <w:rFonts w:ascii="Cambria" w:hAnsi="Cambria" w:eastAsia="ＭＳ 明朝" w:cs="" w:asciiTheme="minorHAnsi" w:cstheme="minorBidi" w:eastAsiaTheme="minorEastAsia" w:hAnsiTheme="minorHAnsi"/>
+      <w:rFonts w:ascii="Cambria" w:hAnsi="Cambria" w:eastAsia="" w:cs="" w:asciiTheme="minorHAnsi" w:cstheme="minorBidi" w:eastAsiaTheme="minorEastAsia" w:hAnsiTheme="minorHAnsi"/>
       <w:color w:val="auto"/>
       <w:kern w:val="0"/>
       <w:sz w:val="22"/>
@@ -2464,7 +2585,7 @@
       <w:contextualSpacing/>
     </w:pPr>
     <w:rPr>
-      <w:rFonts w:ascii="Calibri" w:hAnsi="Calibri" w:eastAsia="ＭＳ ゴシック" w:cs="" w:asciiTheme="majorHAnsi" w:cstheme="majorBidi" w:eastAsiaTheme="majorEastAsia" w:hAnsiTheme="majorHAnsi"/>
+      <w:rFonts w:ascii="Calibri" w:hAnsi="Calibri" w:eastAsia="" w:cs="" w:asciiTheme="majorHAnsi" w:cstheme="majorBidi" w:eastAsiaTheme="majorEastAsia" w:hAnsiTheme="majorHAnsi"/>
       <w:color w:themeColor="text2" w:themeShade="bf" w:val="17365D"/>
       <w:spacing w:val="5"/>
       <w:kern w:val="2"/>
@@ -2482,7 +2603,7 @@
     <w:rsid w:val="00fc693f"/>
     <w:pPr/>
     <w:rPr>
-      <w:rFonts w:ascii="Calibri" w:hAnsi="Calibri" w:eastAsia="ＭＳ ゴシック" w:cs="" w:asciiTheme="majorHAnsi" w:cstheme="majorBidi" w:eastAsiaTheme="majorEastAsia" w:hAnsiTheme="majorHAnsi"/>
+      <w:rFonts w:ascii="Calibri" w:hAnsi="Calibri" w:eastAsia="" w:cs="" w:asciiTheme="majorHAnsi" w:cstheme="majorBidi" w:eastAsiaTheme="majorEastAsia" w:hAnsiTheme="majorHAnsi"/>
       <w:i/>
       <w:iCs/>
       <w:color w:themeColor="accent1" w:val="4F81BD"/>
@@ -2715,12 +2836,13 @@
         <w:tab w:val="left" w:pos="3456" w:leader="none"/>
         <w:tab w:val="left" w:pos="4032" w:leader="none"/>
       </w:tabs>
+      <w:suppressAutoHyphens w:val="true"/>
       <w:bidi w:val="0"/>
       <w:spacing w:lineRule="auto" w:line="276" w:before="0" w:after="200"/>
       <w:jc w:val="start"/>
     </w:pPr>
     <w:rPr>
-      <w:rFonts w:ascii="Courier" w:hAnsi="Courier" w:eastAsia="ＭＳ 明朝" w:cs="" w:cstheme="minorBidi" w:eastAsiaTheme="minorEastAsia"/>
+      <w:rFonts w:ascii="Courier" w:hAnsi="Courier" w:eastAsia="" w:cs="" w:cstheme="minorBidi" w:eastAsiaTheme="minorEastAsia"/>
       <w:color w:val="auto"/>
       <w:kern w:val="0"/>
       <w:sz w:val="20"/>
@@ -2768,7 +2890,7 @@
   </w:style>
   <w:style w:type="paragraph" w:styleId="IndexHeading">
     <w:name w:val="index heading"/>
-    <w:basedOn w:val="Ttulo"/>
+    <w:basedOn w:val="Ttulouser"/>
     <w:pPr/>
     <w:rPr/>
   </w:style>
@@ -2840,8 +2962,8 @@
       <w:sz w:val="20"/>
     </w:rPr>
   </w:style>
-  <w:style w:type="numbering" w:styleId="Ningunalista" w:default="1">
-    <w:name w:val="Ninguna lista"/>
+  <w:style w:type="numbering" w:styleId="Ningunalistauser" w:default="1">
+    <w:name w:val="Ninguna lista (user)"/>
     <w:uiPriority w:val="99"/>
     <w:semiHidden/>
     <w:unhideWhenUsed/>
@@ -5972,7 +6094,6 @@
       <w:pPr>
         <w:spacing w:before="0" w:after="0" w:line="240" w:lineRule="auto"/>
       </w:pPr>
-      <w:rPr/>
       <w:tblPr/>
       <w:tcPr>
         <w:tcBorders>
@@ -6118,7 +6239,6 @@
       <w:pPr>
         <w:spacing w:before="0" w:after="0" w:line="240" w:lineRule="auto"/>
       </w:pPr>
-      <w:rPr/>
       <w:tblPr/>
       <w:tcPr>
         <w:tcBorders>
@@ -6264,7 +6384,6 @@
       <w:pPr>
         <w:spacing w:before="0" w:after="0" w:line="240" w:lineRule="auto"/>
       </w:pPr>
-      <w:rPr/>
       <w:tblPr/>
       <w:tcPr>
         <w:tcBorders>
@@ -6410,7 +6529,6 @@
       <w:pPr>
         <w:spacing w:before="0" w:after="0" w:line="240" w:lineRule="auto"/>
       </w:pPr>
-      <w:rPr/>
       <w:tblPr/>
       <w:tcPr>
         <w:tcBorders>
@@ -6556,7 +6674,6 @@
       <w:pPr>
         <w:spacing w:before="0" w:after="0" w:line="240" w:lineRule="auto"/>
       </w:pPr>
-      <w:rPr/>
       <w:tblPr/>
       <w:tcPr>
         <w:tcBorders>
@@ -6702,7 +6819,6 @@
       <w:pPr>
         <w:spacing w:before="0" w:after="0" w:line="240" w:lineRule="auto"/>
       </w:pPr>
-      <w:rPr/>
       <w:tblPr/>
       <w:tcPr>
         <w:tcBorders>
@@ -6848,7 +6964,6 @@
       <w:pPr>
         <w:spacing w:before="0" w:after="0" w:line="240" w:lineRule="auto"/>
       </w:pPr>
-      <w:rPr/>
       <w:tblPr/>
       <w:tcPr>
         <w:tcBorders>

</xml_diff>